<commit_message>
added ACMG to template
</commit_message>
<xml_diff>
--- a/izveštaj_template.docx
+++ b/izveštaj_template.docx
@@ -14,12 +14,12 @@
           <wp:inline distB="0" distT="0" distL="0" distR="0">
             <wp:extent cx="5943600" cy="1435100"/>
             <wp:effectExtent b="0" l="0" r="0" t="0"/>
-            <wp:docPr descr="Graphical user interface, application&#10;&#10;Description automatically generated" id="13" name="image1.png"/>
+            <wp:docPr descr="Graphical user interface, application&#10;&#10;Description automatically generated" id="13" name="image3.png"/>
             <a:graphic>
               <a:graphicData uri="http://schemas.openxmlformats.org/drawingml/2006/picture">
                 <pic:pic>
                   <pic:nvPicPr>
-                    <pic:cNvPr descr="Graphical user interface, application&#10;&#10;Description automatically generated" id="0" name="image1.png"/>
+                    <pic:cNvPr descr="Graphical user interface, application&#10;&#10;Description automatically generated" id="0" name="image3.png"/>
                     <pic:cNvPicPr preferRelativeResize="0"/>
                   </pic:nvPicPr>
                   <pic:blipFill>
@@ -2271,7 +2271,7 @@
           <w:szCs w:val="24"/>
           <w:rtl w:val="0"/>
         </w:rPr>
-        <w:t xml:space="preserve"> genu. Prema ACMG kriterijumima za klasifikaciju, ova varijanta klasifikovana je kao {{ varijanta.klasa }} (PM5_Moderate, PM2_Supporting, PP2_Supporting, BP4_Moderate)</w:t>
+        <w:t xml:space="preserve"> genu. Prema ACMG kriterijumima za klasifikaciju, ova varijanta klasifikovana je kao {{ varijanta.klasa }} ({{ varijanta.acmg_oznake }})</w:t>
       </w:r>
       <w:r>
         <w:rPr>
@@ -2288,7 +2288,7 @@
           <w:szCs w:val="24"/>
           <w:rtl w:val="0"/>
         </w:rPr>
-        <w:t xml:space="preserve">. Detektovana varijanta nalazi se u kodonu u kojem je prethodno prijavljena patogena missense varijanta (PM5_Moderate), i nađena je sa niskom učestalošću u GnomAD Exomes i GnomAD Genomes populacionim bazama podataka (PM2_Supporting). Takođe, detektovana varijanta se nalazi u genu u kojem su missense variajnte čest uzrok bolesti (PP2_Supporting), međutim, kompjuterski prediktivni skorovi idu u prilog njenoj benignosti (BP4_Supporting). Zbog svega navedenog, varijanta {{ varijanta.HGVS }} u </w:t>
+        <w:t xml:space="preserve">. {{ varijanta.acmg_tekst }} Zbog svega navedenog, varijanta {{ varijanta.HGVS }} u </w:t>
       </w:r>
       <w:r>
         <w:rPr>
@@ -2603,12 +2603,12 @@
                 <wp:inline distB="0" distT="0" distL="0" distR="0">
                   <wp:extent cx="2076450" cy="438150"/>
                   <wp:effectExtent b="0" l="0" r="0" t="0"/>
-                  <wp:docPr descr="A close-up of a blue pen&#10;&#10;Description automatically generated" id="14" name="image2.jpg"/>
+                  <wp:docPr descr="A close-up of a blue pen&#10;&#10;Description automatically generated" id="14" name="image1.jpg"/>
                   <a:graphic>
                     <a:graphicData uri="http://schemas.openxmlformats.org/drawingml/2006/picture">
                       <pic:pic>
                         <pic:nvPicPr>
-                          <pic:cNvPr descr="A close-up of a blue pen&#10;&#10;Description automatically generated" id="0" name="image2.jpg"/>
+                          <pic:cNvPr descr="A close-up of a blue pen&#10;&#10;Description automatically generated" id="0" name="image1.jpg"/>
                           <pic:cNvPicPr preferRelativeResize="0"/>
                         </pic:nvPicPr>
                         <pic:blipFill>
@@ -2677,12 +2677,12 @@
                 <wp:inline distB="114300" distT="114300" distL="114300" distR="114300">
                   <wp:extent cx="1971675" cy="400050"/>
                   <wp:effectExtent b="0" l="0" r="0" t="0"/>
-                  <wp:docPr id="12" name="image4.png"/>
+                  <wp:docPr id="12" name="image2.png"/>
                   <a:graphic>
                     <a:graphicData uri="http://schemas.openxmlformats.org/drawingml/2006/picture">
                       <pic:pic>
                         <pic:nvPicPr>
-                          <pic:cNvPr id="0" name="image4.png"/>
+                          <pic:cNvPr id="0" name="image2.png"/>
                           <pic:cNvPicPr preferRelativeResize="0"/>
                         </pic:nvPicPr>
                         <pic:blipFill>
@@ -2922,7 +2922,7 @@
     <w:sdt>
       <w:sdtPr>
         <w:lock w:val="contentLocked"/>
-        <w:id w:val="1598525779"/>
+        <w:id w:val="-1335671995"/>
         <w:tag w:val="goog_rdk_0"/>
       </w:sdtPr>
       <w:sdtContent>
@@ -2984,12 +2984,12 @@
                     <wp:inline distB="0" distT="0" distL="0" distR="0">
                       <wp:extent cx="1769528" cy="548860"/>
                       <wp:effectExtent b="0" l="0" r="0" t="0"/>
-                      <wp:docPr id="15" name="image3.png"/>
+                      <wp:docPr id="15" name="image4.png"/>
                       <a:graphic>
                         <a:graphicData uri="http://schemas.openxmlformats.org/drawingml/2006/picture">
                           <pic:pic>
                             <pic:nvPicPr>
-                              <pic:cNvPr id="0" name="image3.png"/>
+                              <pic:cNvPr id="0" name="image4.png"/>
                               <pic:cNvPicPr preferRelativeResize="0"/>
                             </pic:nvPicPr>
                             <pic:blipFill>
@@ -3068,12 +3068,12 @@
                     <wp:inline distB="114300" distT="114300" distL="114300" distR="114300">
                       <wp:extent cx="1971675" cy="400050"/>
                       <wp:effectExtent b="0" l="0" r="0" t="0"/>
-                      <wp:docPr id="11" name="image4.png"/>
+                      <wp:docPr id="11" name="image2.png"/>
                       <a:graphic>
                         <a:graphicData uri="http://schemas.openxmlformats.org/drawingml/2006/picture">
                           <pic:pic>
                             <pic:nvPicPr>
-                              <pic:cNvPr id="0" name="image4.png"/>
+                              <pic:cNvPr id="0" name="image2.png"/>
                               <pic:cNvPicPr preferRelativeResize="0"/>
                             </pic:nvPicPr>
                             <pic:blipFill>

</xml_diff>

<commit_message>
Added Irena and Anita
</commit_message>
<xml_diff>
--- a/izveštaj_template.docx
+++ b/izveštaj_template.docx
@@ -14,12 +14,12 @@
           <wp:inline distB="0" distT="0" distL="0" distR="0">
             <wp:extent cx="5943600" cy="1435100"/>
             <wp:effectExtent b="0" l="0" r="0" t="0"/>
-            <wp:docPr descr="Graphical user interface, application&#10;&#10;Description automatically generated" id="13" name="image3.png"/>
+            <wp:docPr descr="Graphical user interface, application&#10;&#10;Description automatically generated" id="14" name="image2.png"/>
             <a:graphic>
               <a:graphicData uri="http://schemas.openxmlformats.org/drawingml/2006/picture">
                 <pic:pic>
                   <pic:nvPicPr>
-                    <pic:cNvPr descr="Graphical user interface, application&#10;&#10;Description automatically generated" id="0" name="image3.png"/>
+                    <pic:cNvPr descr="Graphical user interface, application&#10;&#10;Description automatically generated" id="0" name="image2.png"/>
                     <pic:cNvPicPr preferRelativeResize="0"/>
                   </pic:nvPicPr>
                   <pic:blipFill>
@@ -2603,7 +2603,7 @@
                 <wp:inline distB="0" distT="0" distL="0" distR="0">
                   <wp:extent cx="2076450" cy="438150"/>
                   <wp:effectExtent b="0" l="0" r="0" t="0"/>
-                  <wp:docPr descr="A close-up of a blue pen&#10;&#10;Description automatically generated" id="14" name="image1.jpg"/>
+                  <wp:docPr descr="A close-up of a blue pen&#10;&#10;Description automatically generated" id="16" name="image1.jpg"/>
                   <a:graphic>
                     <a:graphicData uri="http://schemas.openxmlformats.org/drawingml/2006/picture">
                       <pic:pic>
@@ -2677,12 +2677,12 @@
                 <wp:inline distB="114300" distT="114300" distL="114300" distR="114300">
                   <wp:extent cx="1971675" cy="400050"/>
                   <wp:effectExtent b="0" l="0" r="0" t="0"/>
-                  <wp:docPr id="12" name="image2.png"/>
+                  <wp:docPr id="13" name="image5.png"/>
                   <a:graphic>
                     <a:graphicData uri="http://schemas.openxmlformats.org/drawingml/2006/picture">
                       <pic:pic>
                         <pic:nvPicPr>
-                          <pic:cNvPr id="0" name="image2.png"/>
+                          <pic:cNvPr id="0" name="image5.png"/>
                           <pic:cNvPicPr preferRelativeResize="0"/>
                         </pic:nvPicPr>
                         <pic:blipFill>
@@ -2922,7 +2922,7 @@
     <w:sdt>
       <w:sdtPr>
         <w:lock w:val="contentLocked"/>
-        <w:id w:val="-1335671995"/>
+        <w:id w:val="-108173764"/>
         <w:tag w:val="goog_rdk_0"/>
       </w:sdtPr>
       <w:sdtContent>
@@ -2984,7 +2984,7 @@
                     <wp:inline distB="0" distT="0" distL="0" distR="0">
                       <wp:extent cx="1769528" cy="548860"/>
                       <wp:effectExtent b="0" l="0" r="0" t="0"/>
-                      <wp:docPr id="15" name="image4.png"/>
+                      <wp:docPr id="18" name="image4.png"/>
                       <a:graphic>
                         <a:graphicData uri="http://schemas.openxmlformats.org/drawingml/2006/picture">
                           <pic:pic>
@@ -3068,12 +3068,12 @@
                     <wp:inline distB="114300" distT="114300" distL="114300" distR="114300">
                       <wp:extent cx="1971675" cy="400050"/>
                       <wp:effectExtent b="0" l="0" r="0" t="0"/>
-                      <wp:docPr id="11" name="image2.png"/>
+                      <wp:docPr id="11" name="image5.png"/>
                       <a:graphic>
                         <a:graphicData uri="http://schemas.openxmlformats.org/drawingml/2006/picture">
                           <pic:pic>
                             <pic:nvPicPr>
-                              <pic:cNvPr id="0" name="image2.png"/>
+                              <pic:cNvPr id="0" name="image5.png"/>
                               <pic:cNvPicPr preferRelativeResize="0"/>
                             </pic:nvPicPr>
                             <pic:blipFill>
@@ -3253,6 +3253,819 @@
     </w:p>
     <w:p>
       <w:pPr>
+        <w:tabs>
+          <w:tab w:val="left" w:leader="none" w:pos="0"/>
+        </w:tabs>
+        <w:spacing w:after="200" w:before="200" w:line="276" w:lineRule="auto"/>
+        <w:jc w:val="both"/>
+        <w:rPr>
+          <w:sz w:val="24"/>
+          <w:szCs w:val="24"/>
+        </w:rPr>
+      </w:pPr>
+      <w:r>
+        <w:rPr>
+          <w:sz w:val="24"/>
+          <w:szCs w:val="24"/>
+          <w:rtl w:val="0"/>
+        </w:rPr>
+        <w:t xml:space="preserve">{%p if analizator == </w:t>
+      </w:r>
+      <w:r>
+        <w:rPr>
+          <w:sz w:val="24"/>
+          <w:szCs w:val="24"/>
+          <w:highlight w:val="white"/>
+          <w:rtl w:val="0"/>
+        </w:rPr>
+        <w:t xml:space="preserve">"</w:t>
+      </w:r>
+      <w:r>
+        <w:rPr>
+          <w:sz w:val="24"/>
+          <w:szCs w:val="24"/>
+          <w:rtl w:val="0"/>
+        </w:rPr>
+        <w:t xml:space="preserve">Irena</w:t>
+      </w:r>
+      <w:r>
+        <w:rPr>
+          <w:sz w:val="24"/>
+          <w:szCs w:val="24"/>
+          <w:highlight w:val="white"/>
+          <w:rtl w:val="0"/>
+        </w:rPr>
+        <w:t xml:space="preserve">"</w:t>
+      </w:r>
+      <w:r>
+        <w:rPr>
+          <w:sz w:val="24"/>
+          <w:szCs w:val="24"/>
+          <w:rtl w:val="0"/>
+        </w:rPr>
+        <w:t xml:space="preserve"> %}</w:t>
+      </w:r>
+    </w:p>
+    <w:p>
+      <w:pPr>
+        <w:tabs>
+          <w:tab w:val="left" w:leader="none" w:pos="0"/>
+        </w:tabs>
+        <w:spacing w:after="200" w:before="200" w:line="276" w:lineRule="auto"/>
+        <w:jc w:val="both"/>
+        <w:rPr>
+          <w:sz w:val="24"/>
+          <w:szCs w:val="24"/>
+        </w:rPr>
+      </w:pPr>
+      <w:r>
+        <w:rPr>
+          <w:rtl w:val="0"/>
+        </w:rPr>
+      </w:r>
+    </w:p>
+    <w:sdt>
+      <w:sdtPr>
+        <w:lock w:val="contentLocked"/>
+        <w:id w:val="419292420"/>
+        <w:tag w:val="goog_rdk_1"/>
+      </w:sdtPr>
+      <w:sdtContent>
+        <w:tbl>
+          <w:tblPr>
+            <w:tblStyle w:val="Table5"/>
+            <w:tblW w:w="9270.0" w:type="dxa"/>
+            <w:jc w:val="center"/>
+            <w:tblLayout w:type="fixed"/>
+            <w:tblLook w:val="0400"/>
+          </w:tblPr>
+          <w:tblGrid>
+            <w:gridCol w:w="4635"/>
+            <w:gridCol w:w="4635"/>
+            <w:tblGridChange w:id="0">
+              <w:tblGrid>
+                <w:gridCol w:w="4635"/>
+                <w:gridCol w:w="4635"/>
+              </w:tblGrid>
+            </w:tblGridChange>
+          </w:tblGrid>
+          <w:tr>
+            <w:trPr>
+              <w:cantSplit w:val="0"/>
+              <w:tblHeader w:val="0"/>
+            </w:trPr>
+            <w:tc>
+              <w:tcPr>
+                <w:shd w:fill="auto" w:val="clear"/>
+              </w:tcPr>
+              <w:p>
+                <w:pPr>
+                  <w:spacing w:after="0" w:line="276" w:lineRule="auto"/>
+                  <w:rPr>
+                    <w:sz w:val="24"/>
+                    <w:szCs w:val="24"/>
+                  </w:rPr>
+                </w:pPr>
+                <w:r>
+                  <w:rPr>
+                    <w:sz w:val="24"/>
+                    <w:szCs w:val="24"/>
+                    <w:rtl w:val="0"/>
+                  </w:rPr>
+                  <w:t xml:space="preserve">Analizu izvršili</w:t>
+                </w:r>
+              </w:p>
+              <w:p>
+                <w:pPr>
+                  <w:spacing w:after="0" w:lineRule="auto"/>
+                  <w:rPr>
+                    <w:sz w:val="24"/>
+                    <w:szCs w:val="24"/>
+                  </w:rPr>
+                </w:pPr>
+                <w:r>
+                  <w:rPr>
+                    <w:sz w:val="24"/>
+                    <w:szCs w:val="24"/>
+                  </w:rPr>
+                  <w:drawing>
+                    <wp:inline distB="0" distT="0" distL="0" distR="0">
+                      <wp:extent cx="1614488" cy="563789"/>
+                      <wp:effectExtent b="0" l="0" r="0" t="0"/>
+                      <wp:docPr id="19" name="image3.png"/>
+                      <a:graphic>
+                        <a:graphicData uri="http://schemas.openxmlformats.org/drawingml/2006/picture">
+                          <pic:pic>
+                            <pic:nvPicPr>
+                              <pic:cNvPr id="0" name="image3.png"/>
+                              <pic:cNvPicPr preferRelativeResize="0"/>
+                            </pic:nvPicPr>
+                            <pic:blipFill>
+                              <a:blip r:embed="rId11"/>
+                              <a:srcRect b="0" l="0" r="0" t="0"/>
+                              <a:stretch>
+                                <a:fillRect/>
+                              </a:stretch>
+                            </pic:blipFill>
+                            <pic:spPr>
+                              <a:xfrm>
+                                <a:off x="0" y="0"/>
+                                <a:ext cx="1614488" cy="563789"/>
+                              </a:xfrm>
+                              <a:prstGeom prst="rect"/>
+                              <a:ln/>
+                            </pic:spPr>
+                          </pic:pic>
+                        </a:graphicData>
+                      </a:graphic>
+                    </wp:inline>
+                  </w:drawing>
+                </w:r>
+                <w:r>
+                  <w:rPr>
+                    <w:rtl w:val="0"/>
+                  </w:rPr>
+                </w:r>
+              </w:p>
+            </w:tc>
+            <w:tc>
+              <w:tcPr>
+                <w:tcMar>
+                  <w:top w:w="0.0" w:type="dxa"/>
+                  <w:left w:w="100.0" w:type="dxa"/>
+                  <w:bottom w:w="0.0" w:type="dxa"/>
+                  <w:right w:w="100.0" w:type="dxa"/>
+                </w:tcMar>
+                <w:vAlign w:val="top"/>
+              </w:tcPr>
+              <w:p>
+                <w:pPr>
+                  <w:spacing w:after="0" w:line="276.0005454545455" w:lineRule="auto"/>
+                  <w:ind w:left="360" w:firstLine="0"/>
+                  <w:jc w:val="both"/>
+                  <w:rPr>
+                    <w:sz w:val="24"/>
+                    <w:szCs w:val="24"/>
+                  </w:rPr>
+                </w:pPr>
+                <w:r>
+                  <w:rPr>
+                    <w:sz w:val="24"/>
+                    <w:szCs w:val="24"/>
+                    <w:rtl w:val="0"/>
+                  </w:rPr>
+                  <w:t xml:space="preserve">Odgovorna osoba </w:t>
+                </w:r>
+              </w:p>
+              <w:p>
+                <w:pPr>
+                  <w:spacing w:after="0" w:line="276" w:lineRule="auto"/>
+                  <w:ind w:left="360" w:firstLine="0"/>
+                  <w:jc w:val="both"/>
+                  <w:rPr>
+                    <w:sz w:val="24"/>
+                    <w:szCs w:val="24"/>
+                  </w:rPr>
+                </w:pPr>
+                <w:r>
+                  <w:rPr>
+                    <w:sz w:val="24"/>
+                    <w:szCs w:val="24"/>
+                  </w:rPr>
+                  <w:drawing>
+                    <wp:inline distB="114300" distT="114300" distL="114300" distR="114300">
+                      <wp:extent cx="1971675" cy="400050"/>
+                      <wp:effectExtent b="0" l="0" r="0" t="0"/>
+                      <wp:docPr id="17" name="image5.png"/>
+                      <a:graphic>
+                        <a:graphicData uri="http://schemas.openxmlformats.org/drawingml/2006/picture">
+                          <pic:pic>
+                            <pic:nvPicPr>
+                              <pic:cNvPr id="0" name="image5.png"/>
+                              <pic:cNvPicPr preferRelativeResize="0"/>
+                            </pic:nvPicPr>
+                            <pic:blipFill>
+                              <a:blip r:embed="rId9"/>
+                              <a:srcRect b="0" l="0" r="0" t="0"/>
+                              <a:stretch>
+                                <a:fillRect/>
+                              </a:stretch>
+                            </pic:blipFill>
+                            <pic:spPr>
+                              <a:xfrm>
+                                <a:off x="0" y="0"/>
+                                <a:ext cx="1971675" cy="400050"/>
+                              </a:xfrm>
+                              <a:prstGeom prst="rect"/>
+                              <a:ln/>
+                            </pic:spPr>
+                          </pic:pic>
+                        </a:graphicData>
+                      </a:graphic>
+                    </wp:inline>
+                  </w:drawing>
+                </w:r>
+                <w:r>
+                  <w:rPr>
+                    <w:rtl w:val="0"/>
+                  </w:rPr>
+                </w:r>
+              </w:p>
+            </w:tc>
+          </w:tr>
+          <w:tr>
+            <w:trPr>
+              <w:cantSplit w:val="0"/>
+              <w:tblHeader w:val="0"/>
+            </w:trPr>
+            <w:tc>
+              <w:tcPr>
+                <w:shd w:fill="auto" w:val="clear"/>
+              </w:tcPr>
+              <w:p>
+                <w:pPr>
+                  <w:spacing w:after="0" w:line="276" w:lineRule="auto"/>
+                  <w:rPr>
+                    <w:sz w:val="24"/>
+                    <w:szCs w:val="24"/>
+                  </w:rPr>
+                </w:pPr>
+                <w:r>
+                  <w:rPr>
+                    <w:sz w:val="24"/>
+                    <w:szCs w:val="24"/>
+                    <w:rtl w:val="0"/>
+                  </w:rPr>
+                  <w:t xml:space="preserve">dr Irena Marjanović</w:t>
+                </w:r>
+              </w:p>
+              <w:p>
+                <w:pPr>
+                  <w:spacing w:after="0" w:line="276" w:lineRule="auto"/>
+                  <w:rPr>
+                    <w:sz w:val="24"/>
+                    <w:szCs w:val="24"/>
+                  </w:rPr>
+                </w:pPr>
+                <w:r>
+                  <w:rPr>
+                    <w:sz w:val="24"/>
+                    <w:szCs w:val="24"/>
+                    <w:rtl w:val="0"/>
+                  </w:rPr>
+                  <w:t xml:space="preserve">Institut za molekularnu genetiku i </w:t>
+                </w:r>
+              </w:p>
+              <w:p>
+                <w:pPr>
+                  <w:spacing w:after="0" w:line="276" w:lineRule="auto"/>
+                  <w:rPr>
+                    <w:sz w:val="24"/>
+                    <w:szCs w:val="24"/>
+                  </w:rPr>
+                </w:pPr>
+                <w:r>
+                  <w:rPr>
+                    <w:sz w:val="24"/>
+                    <w:szCs w:val="24"/>
+                    <w:rtl w:val="0"/>
+                  </w:rPr>
+                  <w:t xml:space="preserve">genetičko inženjerstvo</w:t>
+                </w:r>
+              </w:p>
+            </w:tc>
+            <w:tc>
+              <w:tcPr>
+                <w:tcMar>
+                  <w:top w:w="0.0" w:type="dxa"/>
+                  <w:left w:w="100.0" w:type="dxa"/>
+                  <w:bottom w:w="0.0" w:type="dxa"/>
+                  <w:right w:w="100.0" w:type="dxa"/>
+                </w:tcMar>
+                <w:vAlign w:val="top"/>
+              </w:tcPr>
+              <w:p>
+                <w:pPr>
+                  <w:spacing w:after="0" w:line="276.0005454545455" w:lineRule="auto"/>
+                  <w:ind w:left="360" w:firstLine="0"/>
+                  <w:rPr>
+                    <w:sz w:val="24"/>
+                    <w:szCs w:val="24"/>
+                  </w:rPr>
+                </w:pPr>
+                <w:r>
+                  <w:rPr>
+                    <w:sz w:val="24"/>
+                    <w:szCs w:val="24"/>
+                    <w:rtl w:val="0"/>
+                  </w:rPr>
+                  <w:t xml:space="preserve">dr Marina Anđelković Nikolić</w:t>
+                </w:r>
+              </w:p>
+              <w:p>
+                <w:pPr>
+                  <w:spacing w:after="0" w:line="276.0005454545455" w:lineRule="auto"/>
+                  <w:ind w:left="360" w:firstLine="0"/>
+                  <w:rPr>
+                    <w:sz w:val="24"/>
+                    <w:szCs w:val="24"/>
+                  </w:rPr>
+                </w:pPr>
+                <w:r>
+                  <w:rPr>
+                    <w:sz w:val="24"/>
+                    <w:szCs w:val="24"/>
+                    <w:rtl w:val="0"/>
+                  </w:rPr>
+                  <w:t xml:space="preserve">Institut za molekularnu genetiku</w:t>
+                </w:r>
+              </w:p>
+              <w:p>
+                <w:pPr>
+                  <w:spacing w:after="0" w:line="276.0005454545455" w:lineRule="auto"/>
+                  <w:ind w:left="360" w:firstLine="0"/>
+                  <w:rPr>
+                    <w:sz w:val="24"/>
+                    <w:szCs w:val="24"/>
+                  </w:rPr>
+                </w:pPr>
+                <w:r>
+                  <w:rPr>
+                    <w:sz w:val="24"/>
+                    <w:szCs w:val="24"/>
+                    <w:rtl w:val="0"/>
+                  </w:rPr>
+                  <w:t xml:space="preserve">i genetičko inženjerstvo</w:t>
+                </w:r>
+              </w:p>
+            </w:tc>
+          </w:tr>
+        </w:tbl>
+      </w:sdtContent>
+    </w:sdt>
+    <w:p>
+      <w:pPr>
+        <w:rPr>
+          <w:sz w:val="24"/>
+          <w:szCs w:val="24"/>
+        </w:rPr>
+      </w:pPr>
+      <w:r>
+        <w:rPr>
+          <w:sz w:val="24"/>
+          <w:szCs w:val="24"/>
+          <w:rtl w:val="0"/>
+        </w:rPr>
+        <w:t xml:space="preserve">{%p endif %}</w:t>
+      </w:r>
+    </w:p>
+    <w:p>
+      <w:pPr>
+        <w:tabs>
+          <w:tab w:val="left" w:leader="none" w:pos="0"/>
+        </w:tabs>
+        <w:spacing w:after="200" w:before="200" w:line="276" w:lineRule="auto"/>
+        <w:jc w:val="both"/>
+        <w:rPr>
+          <w:sz w:val="24"/>
+          <w:szCs w:val="24"/>
+        </w:rPr>
+      </w:pPr>
+      <w:r>
+        <w:rPr>
+          <w:sz w:val="24"/>
+          <w:szCs w:val="24"/>
+          <w:rtl w:val="0"/>
+        </w:rPr>
+        <w:t xml:space="preserve">{%p if analizator == </w:t>
+      </w:r>
+      <w:r>
+        <w:rPr>
+          <w:sz w:val="24"/>
+          <w:szCs w:val="24"/>
+          <w:highlight w:val="white"/>
+          <w:rtl w:val="0"/>
+        </w:rPr>
+        <w:t xml:space="preserve">"</w:t>
+      </w:r>
+      <w:r>
+        <w:rPr>
+          <w:sz w:val="24"/>
+          <w:szCs w:val="24"/>
+          <w:rtl w:val="0"/>
+        </w:rPr>
+        <w:t xml:space="preserve">Anita</w:t>
+      </w:r>
+      <w:r>
+        <w:rPr>
+          <w:sz w:val="24"/>
+          <w:szCs w:val="24"/>
+          <w:highlight w:val="white"/>
+          <w:rtl w:val="0"/>
+        </w:rPr>
+        <w:t xml:space="preserve">"</w:t>
+      </w:r>
+      <w:r>
+        <w:rPr>
+          <w:sz w:val="24"/>
+          <w:szCs w:val="24"/>
+          <w:rtl w:val="0"/>
+        </w:rPr>
+        <w:t xml:space="preserve"> %}</w:t>
+      </w:r>
+    </w:p>
+    <w:p>
+      <w:pPr>
+        <w:tabs>
+          <w:tab w:val="left" w:leader="none" w:pos="0"/>
+        </w:tabs>
+        <w:spacing w:after="200" w:before="200" w:line="276" w:lineRule="auto"/>
+        <w:jc w:val="both"/>
+        <w:rPr>
+          <w:sz w:val="24"/>
+          <w:szCs w:val="24"/>
+        </w:rPr>
+      </w:pPr>
+      <w:r>
+        <w:rPr>
+          <w:rtl w:val="0"/>
+        </w:rPr>
+      </w:r>
+    </w:p>
+    <w:sdt>
+      <w:sdtPr>
+        <w:lock w:val="contentLocked"/>
+        <w:id w:val="229998893"/>
+        <w:tag w:val="goog_rdk_2"/>
+      </w:sdtPr>
+      <w:sdtContent>
+        <w:tbl>
+          <w:tblPr>
+            <w:tblStyle w:val="Table6"/>
+            <w:tblW w:w="9270.0" w:type="dxa"/>
+            <w:jc w:val="center"/>
+            <w:tblLayout w:type="fixed"/>
+            <w:tblLook w:val="0400"/>
+          </w:tblPr>
+          <w:tblGrid>
+            <w:gridCol w:w="4635"/>
+            <w:gridCol w:w="4635"/>
+            <w:tblGridChange w:id="0">
+              <w:tblGrid>
+                <w:gridCol w:w="4635"/>
+                <w:gridCol w:w="4635"/>
+              </w:tblGrid>
+            </w:tblGridChange>
+          </w:tblGrid>
+          <w:tr>
+            <w:trPr>
+              <w:cantSplit w:val="0"/>
+              <w:tblHeader w:val="0"/>
+            </w:trPr>
+            <w:tc>
+              <w:tcPr>
+                <w:shd w:fill="auto" w:val="clear"/>
+              </w:tcPr>
+              <w:p>
+                <w:pPr>
+                  <w:spacing w:after="0" w:line="276" w:lineRule="auto"/>
+                  <w:rPr>
+                    <w:sz w:val="24"/>
+                    <w:szCs w:val="24"/>
+                  </w:rPr>
+                </w:pPr>
+                <w:r>
+                  <w:rPr>
+                    <w:sz w:val="24"/>
+                    <w:szCs w:val="24"/>
+                    <w:rtl w:val="0"/>
+                  </w:rPr>
+                  <w:t xml:space="preserve">Analizu izvršili</w:t>
+                </w:r>
+              </w:p>
+              <w:p>
+                <w:pPr>
+                  <w:spacing w:after="0" w:before="0" w:line="276" w:lineRule="auto"/>
+                  <w:rPr>
+                    <w:sz w:val="24"/>
+                    <w:szCs w:val="24"/>
+                  </w:rPr>
+                </w:pPr>
+                <w:r>
+                  <w:rPr/>
+                  <w:drawing>
+                    <wp:inline distB="0" distT="0" distL="0" distR="0">
+                      <wp:extent cx="1571239" cy="601917"/>
+                      <wp:effectExtent b="0" l="0" r="0" t="0"/>
+                      <wp:docPr id="15" name="image6.png"/>
+                      <a:graphic>
+                        <a:graphicData uri="http://schemas.openxmlformats.org/drawingml/2006/picture">
+                          <pic:pic>
+                            <pic:nvPicPr>
+                              <pic:cNvPr id="0" name="image6.png"/>
+                              <pic:cNvPicPr preferRelativeResize="0"/>
+                            </pic:nvPicPr>
+                            <pic:blipFill>
+                              <a:blip r:embed="rId12"/>
+                              <a:srcRect b="0" l="0" r="0" t="0"/>
+                              <a:stretch>
+                                <a:fillRect/>
+                              </a:stretch>
+                            </pic:blipFill>
+                            <pic:spPr>
+                              <a:xfrm>
+                                <a:off x="0" y="0"/>
+                                <a:ext cx="1571239" cy="601917"/>
+                              </a:xfrm>
+                              <a:prstGeom prst="rect"/>
+                              <a:ln/>
+                            </pic:spPr>
+                          </pic:pic>
+                        </a:graphicData>
+                      </a:graphic>
+                    </wp:inline>
+                  </w:drawing>
+                </w:r>
+                <w:r>
+                  <w:rPr>
+                    <w:rtl w:val="0"/>
+                  </w:rPr>
+                </w:r>
+              </w:p>
+            </w:tc>
+            <w:tc>
+              <w:tcPr>
+                <w:tcMar>
+                  <w:top w:w="0.0" w:type="dxa"/>
+                  <w:left w:w="100.0" w:type="dxa"/>
+                  <w:bottom w:w="0.0" w:type="dxa"/>
+                  <w:right w:w="100.0" w:type="dxa"/>
+                </w:tcMar>
+                <w:vAlign w:val="top"/>
+              </w:tcPr>
+              <w:p>
+                <w:pPr>
+                  <w:spacing w:after="0" w:line="276.0005454545455" w:lineRule="auto"/>
+                  <w:ind w:left="360" w:firstLine="0"/>
+                  <w:jc w:val="both"/>
+                  <w:rPr>
+                    <w:sz w:val="24"/>
+                    <w:szCs w:val="24"/>
+                  </w:rPr>
+                </w:pPr>
+                <w:r>
+                  <w:rPr>
+                    <w:sz w:val="24"/>
+                    <w:szCs w:val="24"/>
+                    <w:rtl w:val="0"/>
+                  </w:rPr>
+                  <w:t xml:space="preserve">Odgovorna osoba </w:t>
+                </w:r>
+              </w:p>
+              <w:p>
+                <w:pPr>
+                  <w:spacing w:after="0" w:line="276" w:lineRule="auto"/>
+                  <w:ind w:left="360" w:firstLine="0"/>
+                  <w:jc w:val="both"/>
+                  <w:rPr>
+                    <w:sz w:val="24"/>
+                    <w:szCs w:val="24"/>
+                  </w:rPr>
+                </w:pPr>
+                <w:r>
+                  <w:rPr>
+                    <w:sz w:val="24"/>
+                    <w:szCs w:val="24"/>
+                  </w:rPr>
+                  <w:drawing>
+                    <wp:inline distB="114300" distT="114300" distL="114300" distR="114300">
+                      <wp:extent cx="1971675" cy="400050"/>
+                      <wp:effectExtent b="0" l="0" r="0" t="0"/>
+                      <wp:docPr id="12" name="image5.png"/>
+                      <a:graphic>
+                        <a:graphicData uri="http://schemas.openxmlformats.org/drawingml/2006/picture">
+                          <pic:pic>
+                            <pic:nvPicPr>
+                              <pic:cNvPr id="0" name="image5.png"/>
+                              <pic:cNvPicPr preferRelativeResize="0"/>
+                            </pic:nvPicPr>
+                            <pic:blipFill>
+                              <a:blip r:embed="rId9"/>
+                              <a:srcRect b="0" l="0" r="0" t="0"/>
+                              <a:stretch>
+                                <a:fillRect/>
+                              </a:stretch>
+                            </pic:blipFill>
+                            <pic:spPr>
+                              <a:xfrm>
+                                <a:off x="0" y="0"/>
+                                <a:ext cx="1971675" cy="400050"/>
+                              </a:xfrm>
+                              <a:prstGeom prst="rect"/>
+                              <a:ln/>
+                            </pic:spPr>
+                          </pic:pic>
+                        </a:graphicData>
+                      </a:graphic>
+                    </wp:inline>
+                  </w:drawing>
+                </w:r>
+                <w:r>
+                  <w:rPr>
+                    <w:rtl w:val="0"/>
+                  </w:rPr>
+                </w:r>
+              </w:p>
+            </w:tc>
+          </w:tr>
+          <w:tr>
+            <w:trPr>
+              <w:cantSplit w:val="0"/>
+              <w:tblHeader w:val="0"/>
+            </w:trPr>
+            <w:tc>
+              <w:tcPr>
+                <w:shd w:fill="auto" w:val="clear"/>
+              </w:tcPr>
+              <w:p>
+                <w:pPr>
+                  <w:spacing w:after="0" w:line="276" w:lineRule="auto"/>
+                  <w:rPr>
+                    <w:sz w:val="24"/>
+                    <w:szCs w:val="24"/>
+                  </w:rPr>
+                </w:pPr>
+                <w:r>
+                  <w:rPr>
+                    <w:sz w:val="24"/>
+                    <w:szCs w:val="24"/>
+                    <w:rtl w:val="0"/>
+                  </w:rPr>
+                  <w:t xml:space="preserve">dr Anita Skakić</w:t>
+                </w:r>
+              </w:p>
+              <w:p>
+                <w:pPr>
+                  <w:spacing w:after="0" w:line="276" w:lineRule="auto"/>
+                  <w:rPr>
+                    <w:sz w:val="24"/>
+                    <w:szCs w:val="24"/>
+                  </w:rPr>
+                </w:pPr>
+                <w:r>
+                  <w:rPr>
+                    <w:sz w:val="24"/>
+                    <w:szCs w:val="24"/>
+                    <w:rtl w:val="0"/>
+                  </w:rPr>
+                  <w:t xml:space="preserve">Institut za molekularnu genetiku i </w:t>
+                </w:r>
+              </w:p>
+              <w:p>
+                <w:pPr>
+                  <w:spacing w:after="0" w:line="276" w:lineRule="auto"/>
+                  <w:rPr>
+                    <w:sz w:val="24"/>
+                    <w:szCs w:val="24"/>
+                  </w:rPr>
+                </w:pPr>
+                <w:r>
+                  <w:rPr>
+                    <w:sz w:val="24"/>
+                    <w:szCs w:val="24"/>
+                    <w:rtl w:val="0"/>
+                  </w:rPr>
+                  <w:t xml:space="preserve">genetičko inženjerstvo</w:t>
+                </w:r>
+              </w:p>
+            </w:tc>
+            <w:tc>
+              <w:tcPr>
+                <w:tcMar>
+                  <w:top w:w="0.0" w:type="dxa"/>
+                  <w:left w:w="100.0" w:type="dxa"/>
+                  <w:bottom w:w="0.0" w:type="dxa"/>
+                  <w:right w:w="100.0" w:type="dxa"/>
+                </w:tcMar>
+                <w:vAlign w:val="top"/>
+              </w:tcPr>
+              <w:p>
+                <w:pPr>
+                  <w:spacing w:after="0" w:line="276.0005454545455" w:lineRule="auto"/>
+                  <w:ind w:left="360" w:firstLine="0"/>
+                  <w:rPr>
+                    <w:sz w:val="24"/>
+                    <w:szCs w:val="24"/>
+                  </w:rPr>
+                </w:pPr>
+                <w:r>
+                  <w:rPr>
+                    <w:sz w:val="24"/>
+                    <w:szCs w:val="24"/>
+                    <w:rtl w:val="0"/>
+                  </w:rPr>
+                  <w:t xml:space="preserve">dr Marina Anđelković Nikolić</w:t>
+                </w:r>
+              </w:p>
+              <w:p>
+                <w:pPr>
+                  <w:spacing w:after="0" w:line="276.0005454545455" w:lineRule="auto"/>
+                  <w:ind w:left="360" w:firstLine="0"/>
+                  <w:rPr>
+                    <w:sz w:val="24"/>
+                    <w:szCs w:val="24"/>
+                  </w:rPr>
+                </w:pPr>
+                <w:r>
+                  <w:rPr>
+                    <w:sz w:val="24"/>
+                    <w:szCs w:val="24"/>
+                    <w:rtl w:val="0"/>
+                  </w:rPr>
+                  <w:t xml:space="preserve">Institut za molekularnu genetiku</w:t>
+                </w:r>
+              </w:p>
+              <w:p>
+                <w:pPr>
+                  <w:spacing w:after="0" w:line="276.0005454545455" w:lineRule="auto"/>
+                  <w:ind w:left="360" w:firstLine="0"/>
+                  <w:rPr>
+                    <w:sz w:val="24"/>
+                    <w:szCs w:val="24"/>
+                  </w:rPr>
+                </w:pPr>
+                <w:r>
+                  <w:rPr>
+                    <w:sz w:val="24"/>
+                    <w:szCs w:val="24"/>
+                    <w:rtl w:val="0"/>
+                  </w:rPr>
+                  <w:t xml:space="preserve">i genetičko inženjerstvo</w:t>
+                </w:r>
+              </w:p>
+            </w:tc>
+          </w:tr>
+        </w:tbl>
+      </w:sdtContent>
+    </w:sdt>
+    <w:p>
+      <w:pPr>
+        <w:rPr>
+          <w:sz w:val="24"/>
+          <w:szCs w:val="24"/>
+        </w:rPr>
+      </w:pPr>
+      <w:r>
+        <w:rPr>
+          <w:sz w:val="24"/>
+          <w:szCs w:val="24"/>
+          <w:rtl w:val="0"/>
+        </w:rPr>
+        <w:t xml:space="preserve">{%p endif %}</w:t>
+      </w:r>
+    </w:p>
+    <w:p>
+      <w:pPr>
         <w:rPr>
           <w:b w:val="1"/>
           <w:bCs w:val="1"/>
@@ -3592,7 +4405,7 @@
       </w:r>
     </w:p>
     <w:sectPr>
-      <w:footerReference r:id="rId11" w:type="default"/>
+      <w:footerReference r:id="rId13" w:type="default"/>
       <w:pgSz w:h="15840" w:w="12240" w:orient="portrait"/>
       <w:pgMar w:bottom="1440" w:top="1440" w:left="1440" w:right="1440" w:header="720" w:footer="720"/>
       <w:pgNumType w:start="1"/>
@@ -4334,6 +5147,32 @@
       </w:tblCellMar>
     </w:tblPr>
   </w:style>
+  <w:style w:type="table" w:styleId="Table5">
+    <w:basedOn w:val="TableNormal"/>
+    <w:tblPr>
+      <w:tblStyleRowBandSize w:val="1"/>
+      <w:tblStyleColBandSize w:val="1"/>
+      <w:tblCellMar>
+        <w:top w:w="0.0" w:type="dxa"/>
+        <w:left w:w="115.0" w:type="dxa"/>
+        <w:bottom w:w="0.0" w:type="dxa"/>
+        <w:right w:w="115.0" w:type="dxa"/>
+      </w:tblCellMar>
+    </w:tblPr>
+  </w:style>
+  <w:style w:type="table" w:styleId="Table6">
+    <w:basedOn w:val="TableNormal"/>
+    <w:tblPr>
+      <w:tblStyleRowBandSize w:val="1"/>
+      <w:tblStyleColBandSize w:val="1"/>
+      <w:tblCellMar>
+        <w:top w:w="0.0" w:type="dxa"/>
+        <w:left w:w="115.0" w:type="dxa"/>
+        <w:bottom w:w="0.0" w:type="dxa"/>
+        <w:right w:w="115.0" w:type="dxa"/>
+      </w:tblCellMar>
+    </w:tblPr>
+  </w:style>
 </w:styles>
 </file>
 
@@ -4634,7 +5473,7 @@
 
 <file path=customXML/item1.xml><?xml version="1.0" encoding="utf-8"?>
 <go:gDocsCustomXmlDataStorage xmlns:go="http://customooxmlschemas.google.com/" xmlns:r="http://schemas.openxmlformats.org/officeDocument/2006/relationships" uri="GoogleDocsCustomDataVersion2">
-  <go:docsCustomData xmlns:go="http://customooxmlschemas.google.com/" roundtripDataSignature="AMtx7mg3HCJIJhqYW7D/HpAImoWLXn7CUQ==">CgMxLjAaHwoBMBIaChgICVIUChJ0YWJsZS5pdzZybjN6NWtmYTUyDmguZ2JsczAxN2pzZWcyMg5oLjl1czByNnY3d3BoNjgAciExR1dqN0V5cEdpMTBZV0d4RU00RUpQUjlXR29QRjZGN28=</go:docsCustomData>
+  <go:docsCustomData xmlns:go="http://customooxmlschemas.google.com/" roundtripDataSignature="AMtx7mh7F5vOaS8oxMqkx4e5BG9TP4WbCQ==">CgMxLjAaHwoBMBIaChgICVIUChJ0YWJsZS5pdzZybjN6NWtmYTUaHwoBMRIaChgICVIUChJ0YWJsZS53dDc4Mm5iNG9ndW8aHwoBMhIaChgICVIUChJ0YWJsZS5oNHdweDBqMXJ1NjEyDmguZ2JsczAxN2pzZWcyMg5oLjl1czByNnY3d3BoNjgAciExR1dqN0V5cEdpMTBZV0d4RU00RUpQUjlXR29QRjZGN28=</go:docsCustomData>
 </go:gDocsCustomXmlDataStorage>
 </file>
 

</xml_diff>

<commit_message>
Minor fixes and cleaning up code 1
</commit_message>
<xml_diff>
--- a/izveštaj_template.docx
+++ b/izveštaj_template.docx
@@ -14,12 +14,12 @@
           <wp:inline distB="0" distT="0" distL="0" distR="0">
             <wp:extent cx="5943600" cy="1435100"/>
             <wp:effectExtent b="0" l="0" r="0" t="0"/>
-            <wp:docPr descr="Graphical user interface, application&#10;&#10;Description automatically generated" id="15" name="image4.png"/>
+            <wp:docPr descr="Graphical user interface, application&#10;&#10;Description automatically generated" id="13" name="image7.png"/>
             <a:graphic>
               <a:graphicData uri="http://schemas.openxmlformats.org/drawingml/2006/picture">
                 <pic:pic>
                   <pic:nvPicPr>
-                    <pic:cNvPr descr="Graphical user interface, application&#10;&#10;Description automatically generated" id="0" name="image4.png"/>
+                    <pic:cNvPr descr="Graphical user interface, application&#10;&#10;Description automatically generated" id="0" name="image7.png"/>
                     <pic:cNvPicPr preferRelativeResize="0"/>
                   </pic:nvPicPr>
                   <pic:blipFill>
@@ -1010,7 +1010,7 @@
                 <w:highlight w:val="white"/>
                 <w:rtl w:val="0"/>
               </w:rPr>
-              <w:t xml:space="preserve">.</w:t>
+              <w:t xml:space="preserve">, koja se nasleđuje {{ varijanta.model }}.</w:t>
             </w:r>
           </w:p>
           <w:p>
@@ -1179,7 +1179,7 @@
                 <w:szCs w:val="24"/>
                 <w:rtl w:val="0"/>
               </w:rPr>
-              <w:t xml:space="preserve">. </w:t>
+              <w:t xml:space="preserve">, koja se nasleđuje {{ varijanta.model }}. </w:t>
             </w:r>
             <w:r>
               <w:rPr>
@@ -2023,7 +2023,7 @@
                 <w:szCs w:val="20"/>
                 <w:rtl w:val="0"/>
               </w:rPr>
-              <w:t xml:space="preserve">Egzon: {{ varijanta.egzon }}</w:t>
+              <w:t xml:space="preserve">{{ varijanta.egzon }}</w:t>
             </w:r>
           </w:p>
         </w:tc>
@@ -2069,7 +2069,7 @@
                 <w:szCs w:val="20"/>
                 <w:rtl w:val="0"/>
               </w:rPr>
-              <w:t xml:space="preserve">MetaRNN: {{ varijanta.skor }}</w:t>
+              <w:t xml:space="preserve">{{ varijanta.skor }}</w:t>
             </w:r>
           </w:p>
         </w:tc>
@@ -3717,12 +3717,12 @@
                 <wp:inline distB="0" distT="0" distL="0" distR="0">
                   <wp:extent cx="2076450" cy="438150"/>
                   <wp:effectExtent b="0" l="0" r="0" t="0"/>
-                  <wp:docPr descr="A close-up of a blue pen&#10;&#10;Description automatically generated" id="17" name="image2.jpg"/>
+                  <wp:docPr descr="A close-up of a blue pen&#10;&#10;Description automatically generated" id="15" name="image1.jpg"/>
                   <a:graphic>
                     <a:graphicData uri="http://schemas.openxmlformats.org/drawingml/2006/picture">
                       <pic:pic>
                         <pic:nvPicPr>
-                          <pic:cNvPr descr="A close-up of a blue pen&#10;&#10;Description automatically generated" id="0" name="image2.jpg"/>
+                          <pic:cNvPr descr="A close-up of a blue pen&#10;&#10;Description automatically generated" id="0" name="image1.jpg"/>
                           <pic:cNvPicPr preferRelativeResize="0"/>
                         </pic:nvPicPr>
                         <pic:blipFill>
@@ -3791,12 +3791,12 @@
                 <wp:inline distB="114300" distT="114300" distL="114300" distR="114300">
                   <wp:extent cx="1971675" cy="400050"/>
                   <wp:effectExtent b="0" l="0" r="0" t="0"/>
-                  <wp:docPr id="14" name="image1.png"/>
+                  <wp:docPr id="19" name="image2.png"/>
                   <a:graphic>
                     <a:graphicData uri="http://schemas.openxmlformats.org/drawingml/2006/picture">
                       <pic:pic>
                         <pic:nvPicPr>
-                          <pic:cNvPr id="0" name="image1.png"/>
+                          <pic:cNvPr id="0" name="image2.png"/>
                           <pic:cNvPicPr preferRelativeResize="0"/>
                         </pic:nvPicPr>
                         <pic:blipFill>
@@ -4036,7 +4036,7 @@
     <w:sdt>
       <w:sdtPr>
         <w:lock w:val="contentLocked"/>
-        <w:id w:val="-146375882"/>
+        <w:id w:val="936583476"/>
         <w:tag w:val="goog_rdk_0"/>
       </w:sdtPr>
       <w:sdtContent>
@@ -4081,7 +4081,7 @@
                     <w:szCs w:val="24"/>
                     <w:rtl w:val="0"/>
                   </w:rPr>
-                  <w:t xml:space="preserve">Analizu izvršili</w:t>
+                  <w:t xml:space="preserve">Analizu izvršio</w:t>
                 </w:r>
               </w:p>
               <w:p>
@@ -4098,7 +4098,7 @@
                     <wp:inline distB="0" distT="0" distL="0" distR="0">
                       <wp:extent cx="1769528" cy="548860"/>
                       <wp:effectExtent b="0" l="0" r="0" t="0"/>
-                      <wp:docPr id="19" name="image6.png"/>
+                      <wp:docPr id="21" name="image6.png"/>
                       <a:graphic>
                         <a:graphicData uri="http://schemas.openxmlformats.org/drawingml/2006/picture">
                           <pic:pic>
@@ -4182,12 +4182,12 @@
                     <wp:inline distB="114300" distT="114300" distL="114300" distR="114300">
                       <wp:extent cx="1971675" cy="400050"/>
                       <wp:effectExtent b="0" l="0" r="0" t="0"/>
-                      <wp:docPr id="11" name="image1.png"/>
+                      <wp:docPr id="11" name="image2.png"/>
                       <a:graphic>
                         <a:graphicData uri="http://schemas.openxmlformats.org/drawingml/2006/picture">
                           <pic:pic>
                             <pic:nvPicPr>
-                              <pic:cNvPr id="0" name="image1.png"/>
+                              <pic:cNvPr id="0" name="image2.png"/>
                               <pic:cNvPicPr preferRelativeResize="0"/>
                             </pic:nvPicPr>
                             <pic:blipFill>
@@ -4441,7 +4441,7 @@
     <w:sdt>
       <w:sdtPr>
         <w:lock w:val="contentLocked"/>
-        <w:id w:val="69412010"/>
+        <w:id w:val="1176583500"/>
         <w:tag w:val="goog_rdk_1"/>
       </w:sdtPr>
       <w:sdtContent>
@@ -4486,7 +4486,7 @@
                     <w:szCs w:val="24"/>
                     <w:rtl w:val="0"/>
                   </w:rPr>
-                  <w:t xml:space="preserve">Analizu izvršili</w:t>
+                  <w:t xml:space="preserve">Analizu izvršila</w:t>
                 </w:r>
               </w:p>
               <w:p>
@@ -4506,12 +4506,12 @@
                     <wp:inline distB="0" distT="0" distL="0" distR="0">
                       <wp:extent cx="1614488" cy="563789"/>
                       <wp:effectExtent b="0" l="0" r="0" t="0"/>
-                      <wp:docPr id="21" name="image7.png"/>
+                      <wp:docPr id="24" name="image5.png"/>
                       <a:graphic>
                         <a:graphicData uri="http://schemas.openxmlformats.org/drawingml/2006/picture">
                           <pic:pic>
                             <pic:nvPicPr>
-                              <pic:cNvPr id="0" name="image7.png"/>
+                              <pic:cNvPr id="0" name="image5.png"/>
                               <pic:cNvPicPr preferRelativeResize="0"/>
                             </pic:nvPicPr>
                             <pic:blipFill>
@@ -4590,12 +4590,12 @@
                     <wp:inline distB="114300" distT="114300" distL="114300" distR="114300">
                       <wp:extent cx="1971675" cy="400050"/>
                       <wp:effectExtent b="0" l="0" r="0" t="0"/>
-                      <wp:docPr id="18" name="image1.png"/>
+                      <wp:docPr id="16" name="image2.png"/>
                       <a:graphic>
                         <a:graphicData uri="http://schemas.openxmlformats.org/drawingml/2006/picture">
                           <pic:pic>
                             <pic:nvPicPr>
-                              <pic:cNvPr id="0" name="image1.png"/>
+                              <pic:cNvPr id="0" name="image2.png"/>
                               <pic:cNvPicPr preferRelativeResize="0"/>
                             </pic:nvPicPr>
                             <pic:blipFill>
@@ -4849,7 +4849,7 @@
     <w:sdt>
       <w:sdtPr>
         <w:lock w:val="contentLocked"/>
-        <w:id w:val="1632216422"/>
+        <w:id w:val="-872237154"/>
         <w:tag w:val="goog_rdk_2"/>
       </w:sdtPr>
       <w:sdtContent>
@@ -4894,7 +4894,7 @@
                     <w:szCs w:val="24"/>
                     <w:rtl w:val="0"/>
                   </w:rPr>
-                  <w:t xml:space="preserve">Analizu izvršili</w:t>
+                  <w:t xml:space="preserve">Analizu izvršila</w:t>
                 </w:r>
               </w:p>
               <w:p>
@@ -4911,12 +4911,12 @@
                     <wp:inline distB="0" distT="0" distL="0" distR="0">
                       <wp:extent cx="1571239" cy="601917"/>
                       <wp:effectExtent b="0" l="0" r="0" t="0"/>
-                      <wp:docPr id="16" name="image3.png"/>
+                      <wp:docPr id="14" name="image8.png"/>
                       <a:graphic>
                         <a:graphicData uri="http://schemas.openxmlformats.org/drawingml/2006/picture">
                           <pic:pic>
                             <pic:nvPicPr>
-                              <pic:cNvPr id="0" name="image3.png"/>
+                              <pic:cNvPr id="0" name="image8.png"/>
                               <pic:cNvPicPr preferRelativeResize="0"/>
                             </pic:nvPicPr>
                             <pic:blipFill>
@@ -4995,12 +4995,12 @@
                     <wp:inline distB="114300" distT="114300" distL="114300" distR="114300">
                       <wp:extent cx="1971675" cy="400050"/>
                       <wp:effectExtent b="0" l="0" r="0" t="0"/>
-                      <wp:docPr id="12" name="image1.png"/>
+                      <wp:docPr id="12" name="image2.png"/>
                       <a:graphic>
                         <a:graphicData uri="http://schemas.openxmlformats.org/drawingml/2006/picture">
                           <pic:pic>
                             <pic:nvPicPr>
-                              <pic:cNvPr id="0" name="image1.png"/>
+                              <pic:cNvPr id="0" name="image2.png"/>
                               <pic:cNvPicPr preferRelativeResize="0"/>
                             </pic:nvPicPr>
                             <pic:blipFill>
@@ -5254,7 +5254,7 @@
     <w:sdt>
       <w:sdtPr>
         <w:lock w:val="contentLocked"/>
-        <w:id w:val="2054275152"/>
+        <w:id w:val="-892271554"/>
         <w:tag w:val="goog_rdk_3"/>
       </w:sdtPr>
       <w:sdtContent>
@@ -5299,7 +5299,7 @@
                     <w:szCs w:val="24"/>
                     <w:rtl w:val="0"/>
                   </w:rPr>
-                  <w:t xml:space="preserve">Analizu izvršili</w:t>
+                  <w:t xml:space="preserve">Analizu izvršio</w:t>
                 </w:r>
               </w:p>
               <w:p>
@@ -5319,12 +5319,12 @@
                     <wp:inline distB="114300" distT="114300" distL="114300" distR="114300">
                       <wp:extent cx="701662" cy="1452563"/>
                       <wp:effectExtent b="0" l="0" r="0" t="0"/>
-                      <wp:docPr id="13" name="image5.jpg"/>
+                      <wp:docPr id="18" name="image3.jpg"/>
                       <a:graphic>
                         <a:graphicData uri="http://schemas.openxmlformats.org/drawingml/2006/picture">
                           <pic:pic>
                             <pic:nvPicPr>
-                              <pic:cNvPr id="0" name="image5.jpg"/>
+                              <pic:cNvPr id="0" name="image3.jpg"/>
                               <pic:cNvPicPr preferRelativeResize="0"/>
                             </pic:nvPicPr>
                             <pic:blipFill>
@@ -5403,12 +5403,12 @@
                     <wp:inline distB="114300" distT="114300" distL="114300" distR="114300">
                       <wp:extent cx="1971675" cy="400050"/>
                       <wp:effectExtent b="0" l="0" r="0" t="0"/>
-                      <wp:docPr id="20" name="image1.png"/>
+                      <wp:docPr id="22" name="image2.png"/>
                       <a:graphic>
                         <a:graphicData uri="http://schemas.openxmlformats.org/drawingml/2006/picture">
                           <pic:pic>
                             <pic:nvPicPr>
-                              <pic:cNvPr id="0" name="image1.png"/>
+                              <pic:cNvPr id="0" name="image2.png"/>
                               <pic:cNvPicPr preferRelativeResize="0"/>
                             </pic:nvPicPr>
                             <pic:blipFill>
@@ -5588,6 +5588,551 @@
     </w:p>
     <w:p>
       <w:pPr>
+        <w:tabs>
+          <w:tab w:val="left" w:leader="none" w:pos="0"/>
+        </w:tabs>
+        <w:spacing w:after="200" w:before="200" w:line="276" w:lineRule="auto"/>
+        <w:jc w:val="both"/>
+        <w:rPr>
+          <w:sz w:val="24"/>
+          <w:szCs w:val="24"/>
+        </w:rPr>
+      </w:pPr>
+      <w:r>
+        <w:rPr>
+          <w:sz w:val="24"/>
+          <w:szCs w:val="24"/>
+          <w:rtl w:val="0"/>
+        </w:rPr>
+        <w:t xml:space="preserve">{%p if analizator == </w:t>
+      </w:r>
+      <w:r>
+        <w:rPr>
+          <w:sz w:val="24"/>
+          <w:szCs w:val="24"/>
+          <w:highlight w:val="white"/>
+          <w:rtl w:val="0"/>
+        </w:rPr>
+        <w:t xml:space="preserve">"</w:t>
+      </w:r>
+      <w:r>
+        <w:rPr>
+          <w:sz w:val="24"/>
+          <w:szCs w:val="24"/>
+          <w:rtl w:val="0"/>
+        </w:rPr>
+        <w:t xml:space="preserve">Makica</w:t>
+      </w:r>
+      <w:r>
+        <w:rPr>
+          <w:sz w:val="24"/>
+          <w:szCs w:val="24"/>
+          <w:highlight w:val="white"/>
+          <w:rtl w:val="0"/>
+        </w:rPr>
+        <w:t xml:space="preserve">"</w:t>
+      </w:r>
+      <w:r>
+        <w:rPr>
+          <w:sz w:val="24"/>
+          <w:szCs w:val="24"/>
+          <w:rtl w:val="0"/>
+        </w:rPr>
+        <w:t xml:space="preserve"> %}</w:t>
+      </w:r>
+    </w:p>
+    <w:p>
+      <w:pPr>
+        <w:tabs>
+          <w:tab w:val="left" w:leader="none" w:pos="0"/>
+        </w:tabs>
+        <w:spacing w:after="200" w:before="200" w:line="276" w:lineRule="auto"/>
+        <w:jc w:val="both"/>
+        <w:rPr>
+          <w:sz w:val="24"/>
+          <w:szCs w:val="24"/>
+        </w:rPr>
+      </w:pPr>
+      <w:r>
+        <w:rPr>
+          <w:rtl w:val="0"/>
+        </w:rPr>
+      </w:r>
+    </w:p>
+    <w:sdt>
+      <w:sdtPr>
+        <w:lock w:val="contentLocked"/>
+        <w:id w:val="2028827038"/>
+        <w:tag w:val="goog_rdk_4"/>
+      </w:sdtPr>
+      <w:sdtContent>
+        <w:tbl>
+          <w:tblPr>
+            <w:tblStyle w:val="Table9"/>
+            <w:tblW w:w="9270.0" w:type="dxa"/>
+            <w:jc w:val="center"/>
+            <w:tblLayout w:type="fixed"/>
+            <w:tblLook w:val="0400"/>
+          </w:tblPr>
+          <w:tblGrid>
+            <w:gridCol w:w="4635"/>
+            <w:gridCol w:w="4635"/>
+            <w:tblGridChange w:id="0">
+              <w:tblGrid>
+                <w:gridCol w:w="4635"/>
+                <w:gridCol w:w="4635"/>
+              </w:tblGrid>
+            </w:tblGridChange>
+          </w:tblGrid>
+          <w:tr>
+            <w:trPr>
+              <w:cantSplit w:val="0"/>
+              <w:tblHeader w:val="0"/>
+            </w:trPr>
+            <w:tc>
+              <w:tcPr>
+                <w:shd w:fill="auto" w:val="clear"/>
+              </w:tcPr>
+              <w:p>
+                <w:pPr>
+                  <w:spacing w:after="0" w:line="276" w:lineRule="auto"/>
+                  <w:rPr>
+                    <w:sz w:val="24"/>
+                    <w:szCs w:val="24"/>
+                  </w:rPr>
+                </w:pPr>
+                <w:r>
+                  <w:rPr>
+                    <w:sz w:val="24"/>
+                    <w:szCs w:val="24"/>
+                    <w:rtl w:val="0"/>
+                  </w:rPr>
+                  <w:t xml:space="preserve">Analizu izvršile</w:t>
+                </w:r>
+              </w:p>
+              <w:p>
+                <w:pPr>
+                  <w:spacing w:after="0" w:line="276" w:lineRule="auto"/>
+                  <w:rPr>
+                    <w:sz w:val="24"/>
+                    <w:szCs w:val="24"/>
+                  </w:rPr>
+                </w:pPr>
+                <w:r>
+                  <w:rPr/>
+                  <w:drawing>
+                    <wp:inline distB="0" distT="0" distL="0" distR="0">
+                      <wp:extent cx="1571239" cy="601917"/>
+                      <wp:effectExtent b="0" l="0" r="0" t="0"/>
+                      <wp:docPr id="17" name="image8.png"/>
+                      <a:graphic>
+                        <a:graphicData uri="http://schemas.openxmlformats.org/drawingml/2006/picture">
+                          <pic:pic>
+                            <pic:nvPicPr>
+                              <pic:cNvPr id="0" name="image8.png"/>
+                              <pic:cNvPicPr preferRelativeResize="0"/>
+                            </pic:nvPicPr>
+                            <pic:blipFill>
+                              <a:blip r:embed="rId12"/>
+                              <a:srcRect b="0" l="0" r="0" t="0"/>
+                              <a:stretch>
+                                <a:fillRect/>
+                              </a:stretch>
+                            </pic:blipFill>
+                            <pic:spPr>
+                              <a:xfrm>
+                                <a:off x="0" y="0"/>
+                                <a:ext cx="1571239" cy="601917"/>
+                              </a:xfrm>
+                              <a:prstGeom prst="rect"/>
+                              <a:ln/>
+                            </pic:spPr>
+                          </pic:pic>
+                        </a:graphicData>
+                      </a:graphic>
+                    </wp:inline>
+                  </w:drawing>
+                </w:r>
+                <w:r>
+                  <w:rPr>
+                    <w:rtl w:val="0"/>
+                  </w:rPr>
+                </w:r>
+              </w:p>
+            </w:tc>
+            <w:tc>
+              <w:tcPr>
+                <w:tcMar>
+                  <w:top w:w="0.0" w:type="dxa"/>
+                  <w:left w:w="100.0" w:type="dxa"/>
+                  <w:bottom w:w="0.0" w:type="dxa"/>
+                  <w:right w:w="100.0" w:type="dxa"/>
+                </w:tcMar>
+                <w:vAlign w:val="top"/>
+              </w:tcPr>
+              <w:p>
+                <w:pPr>
+                  <w:spacing w:after="0" w:line="276.0005454545455" w:lineRule="auto"/>
+                  <w:ind w:left="360" w:firstLine="0"/>
+                  <w:jc w:val="both"/>
+                  <w:rPr>
+                    <w:sz w:val="24"/>
+                    <w:szCs w:val="24"/>
+                  </w:rPr>
+                </w:pPr>
+                <w:r>
+                  <w:rPr>
+                    <w:sz w:val="24"/>
+                    <w:szCs w:val="24"/>
+                    <w:rtl w:val="0"/>
+                  </w:rPr>
+                  <w:t xml:space="preserve">Odgovorna osoba </w:t>
+                </w:r>
+              </w:p>
+              <w:p>
+                <w:pPr>
+                  <w:spacing w:after="0" w:line="276" w:lineRule="auto"/>
+                  <w:ind w:left="360" w:firstLine="0"/>
+                  <w:jc w:val="both"/>
+                  <w:rPr>
+                    <w:sz w:val="24"/>
+                    <w:szCs w:val="24"/>
+                  </w:rPr>
+                </w:pPr>
+                <w:r>
+                  <w:rPr>
+                    <w:sz w:val="24"/>
+                    <w:szCs w:val="24"/>
+                  </w:rPr>
+                  <w:drawing>
+                    <wp:inline distB="114300" distT="114300" distL="114300" distR="114300">
+                      <wp:extent cx="1971675" cy="400050"/>
+                      <wp:effectExtent b="0" l="0" r="0" t="0"/>
+                      <wp:docPr id="20" name="image2.png"/>
+                      <a:graphic>
+                        <a:graphicData uri="http://schemas.openxmlformats.org/drawingml/2006/picture">
+                          <pic:pic>
+                            <pic:nvPicPr>
+                              <pic:cNvPr id="0" name="image2.png"/>
+                              <pic:cNvPicPr preferRelativeResize="0"/>
+                            </pic:nvPicPr>
+                            <pic:blipFill>
+                              <a:blip r:embed="rId9"/>
+                              <a:srcRect b="0" l="0" r="0" t="0"/>
+                              <a:stretch>
+                                <a:fillRect/>
+                              </a:stretch>
+                            </pic:blipFill>
+                            <pic:spPr>
+                              <a:xfrm>
+                                <a:off x="0" y="0"/>
+                                <a:ext cx="1971675" cy="400050"/>
+                              </a:xfrm>
+                              <a:prstGeom prst="rect"/>
+                              <a:ln/>
+                            </pic:spPr>
+                          </pic:pic>
+                        </a:graphicData>
+                      </a:graphic>
+                    </wp:inline>
+                  </w:drawing>
+                </w:r>
+                <w:r>
+                  <w:rPr>
+                    <w:rtl w:val="0"/>
+                  </w:rPr>
+                </w:r>
+              </w:p>
+            </w:tc>
+          </w:tr>
+          <w:tr>
+            <w:trPr>
+              <w:cantSplit w:val="0"/>
+              <w:tblHeader w:val="0"/>
+            </w:trPr>
+            <w:tc>
+              <w:tcPr>
+                <w:shd w:fill="auto" w:val="clear"/>
+              </w:tcPr>
+              <w:p>
+                <w:pPr>
+                  <w:spacing w:after="0" w:line="276" w:lineRule="auto"/>
+                  <w:rPr>
+                    <w:sz w:val="24"/>
+                    <w:szCs w:val="24"/>
+                  </w:rPr>
+                </w:pPr>
+                <w:r>
+                  <w:rPr>
+                    <w:sz w:val="24"/>
+                    <w:szCs w:val="24"/>
+                    <w:rtl w:val="0"/>
+                  </w:rPr>
+                  <w:t xml:space="preserve">dr Anita Skakić</w:t>
+                </w:r>
+              </w:p>
+              <w:p>
+                <w:pPr>
+                  <w:spacing w:after="0" w:line="276" w:lineRule="auto"/>
+                  <w:rPr>
+                    <w:sz w:val="24"/>
+                    <w:szCs w:val="24"/>
+                  </w:rPr>
+                </w:pPr>
+                <w:r>
+                  <w:rPr>
+                    <w:sz w:val="24"/>
+                    <w:szCs w:val="24"/>
+                    <w:rtl w:val="0"/>
+                  </w:rPr>
+                  <w:t xml:space="preserve">Institut za molekularnu genetiku i </w:t>
+                </w:r>
+              </w:p>
+              <w:p>
+                <w:pPr>
+                  <w:spacing w:after="0" w:line="276" w:lineRule="auto"/>
+                  <w:rPr>
+                    <w:sz w:val="24"/>
+                    <w:szCs w:val="24"/>
+                  </w:rPr>
+                </w:pPr>
+                <w:r>
+                  <w:rPr>
+                    <w:sz w:val="24"/>
+                    <w:szCs w:val="24"/>
+                    <w:rtl w:val="0"/>
+                  </w:rPr>
+                  <w:t xml:space="preserve">genetičko inženjerstvo</w:t>
+                </w:r>
+              </w:p>
+            </w:tc>
+            <w:tc>
+              <w:tcPr>
+                <w:tcMar>
+                  <w:top w:w="0.0" w:type="dxa"/>
+                  <w:left w:w="100.0" w:type="dxa"/>
+                  <w:bottom w:w="0.0" w:type="dxa"/>
+                  <w:right w:w="100.0" w:type="dxa"/>
+                </w:tcMar>
+                <w:vAlign w:val="top"/>
+              </w:tcPr>
+              <w:p>
+                <w:pPr>
+                  <w:spacing w:after="0" w:line="276.0005454545455" w:lineRule="auto"/>
+                  <w:ind w:left="360" w:firstLine="0"/>
+                  <w:rPr>
+                    <w:sz w:val="24"/>
+                    <w:szCs w:val="24"/>
+                  </w:rPr>
+                </w:pPr>
+                <w:r>
+                  <w:rPr>
+                    <w:sz w:val="24"/>
+                    <w:szCs w:val="24"/>
+                    <w:rtl w:val="0"/>
+                  </w:rPr>
+                  <w:t xml:space="preserve">dr Marina Anđelković Nikolić</w:t>
+                </w:r>
+              </w:p>
+              <w:p>
+                <w:pPr>
+                  <w:spacing w:after="0" w:line="276.0005454545455" w:lineRule="auto"/>
+                  <w:ind w:left="360" w:firstLine="0"/>
+                  <w:rPr>
+                    <w:sz w:val="24"/>
+                    <w:szCs w:val="24"/>
+                  </w:rPr>
+                </w:pPr>
+                <w:r>
+                  <w:rPr>
+                    <w:sz w:val="24"/>
+                    <w:szCs w:val="24"/>
+                    <w:rtl w:val="0"/>
+                  </w:rPr>
+                  <w:t xml:space="preserve">Institut za molekularnu genetiku</w:t>
+                </w:r>
+              </w:p>
+              <w:p>
+                <w:pPr>
+                  <w:spacing w:after="0" w:line="276.0005454545455" w:lineRule="auto"/>
+                  <w:ind w:left="360" w:firstLine="0"/>
+                  <w:rPr>
+                    <w:sz w:val="24"/>
+                    <w:szCs w:val="24"/>
+                  </w:rPr>
+                </w:pPr>
+                <w:r>
+                  <w:rPr>
+                    <w:sz w:val="24"/>
+                    <w:szCs w:val="24"/>
+                    <w:rtl w:val="0"/>
+                  </w:rPr>
+                  <w:t xml:space="preserve">i genetičko inženjerstvo</w:t>
+                </w:r>
+              </w:p>
+            </w:tc>
+          </w:tr>
+          <w:tr>
+            <w:trPr>
+              <w:cantSplit w:val="0"/>
+              <w:tblHeader w:val="0"/>
+            </w:trPr>
+            <w:tc>
+              <w:tcPr>
+                <w:shd w:fill="auto" w:val="clear"/>
+              </w:tcPr>
+              <w:p>
+                <w:pPr>
+                  <w:spacing w:after="0" w:line="276" w:lineRule="auto"/>
+                  <w:rPr/>
+                </w:pPr>
+                <w:r>
+                  <w:rPr/>
+                  <w:drawing>
+                    <wp:inline distB="0" distT="0" distL="0" distR="0">
+                      <wp:extent cx="476868" cy="1228845"/>
+                      <wp:effectExtent b="0" l="0" r="0" t="0"/>
+                      <wp:docPr id="23" name="image4.png"/>
+                      <a:graphic>
+                        <a:graphicData uri="http://schemas.openxmlformats.org/drawingml/2006/picture">
+                          <pic:pic>
+                            <pic:nvPicPr>
+                              <pic:cNvPr id="0" name="image4.png"/>
+                              <pic:cNvPicPr preferRelativeResize="0"/>
+                            </pic:nvPicPr>
+                            <pic:blipFill>
+                              <a:blip r:embed="rId14"/>
+                              <a:srcRect b="25494" l="35112" r="48427" t="32055"/>
+                              <a:stretch>
+                                <a:fillRect/>
+                              </a:stretch>
+                            </pic:blipFill>
+                            <pic:spPr>
+                              <a:xfrm rot="16200000">
+                                <a:off x="0" y="0"/>
+                                <a:ext cx="476868" cy="1228845"/>
+                              </a:xfrm>
+                              <a:prstGeom prst="rect"/>
+                              <a:ln/>
+                            </pic:spPr>
+                          </pic:pic>
+                        </a:graphicData>
+                      </a:graphic>
+                    </wp:inline>
+                  </w:drawing>
+                </w:r>
+                <w:r>
+                  <w:rPr>
+                    <w:rtl w:val="0"/>
+                  </w:rPr>
+                </w:r>
+              </w:p>
+              <w:p>
+                <w:pPr>
+                  <w:spacing w:after="0" w:line="276" w:lineRule="auto"/>
+                  <w:jc w:val="both"/>
+                  <w:rPr>
+                    <w:sz w:val="24"/>
+                    <w:szCs w:val="24"/>
+                  </w:rPr>
+                </w:pPr>
+                <w:r>
+                  <w:rPr>
+                    <w:sz w:val="24"/>
+                    <w:szCs w:val="24"/>
+                    <w:rtl w:val="0"/>
+                  </w:rPr>
+                  <w:t xml:space="preserve">Marina Parezanović</w:t>
+                </w:r>
+              </w:p>
+              <w:p>
+                <w:pPr>
+                  <w:spacing w:after="0" w:line="276" w:lineRule="auto"/>
+                  <w:rPr>
+                    <w:sz w:val="24"/>
+                    <w:szCs w:val="24"/>
+                  </w:rPr>
+                </w:pPr>
+                <w:r>
+                  <w:rPr>
+                    <w:sz w:val="24"/>
+                    <w:szCs w:val="24"/>
+                    <w:rtl w:val="0"/>
+                  </w:rPr>
+                  <w:t xml:space="preserve">Institut za molekularnu genetiku i </w:t>
+                </w:r>
+              </w:p>
+              <w:p>
+                <w:pPr>
+                  <w:spacing w:after="0" w:line="276" w:lineRule="auto"/>
+                  <w:rPr>
+                    <w:sz w:val="26"/>
+                    <w:szCs w:val="26"/>
+                  </w:rPr>
+                </w:pPr>
+                <w:r>
+                  <w:rPr>
+                    <w:sz w:val="24"/>
+                    <w:szCs w:val="24"/>
+                    <w:rtl w:val="0"/>
+                  </w:rPr>
+                  <w:t xml:space="preserve">genetičko inženjerstvo</w:t>
+                </w:r>
+                <w:r>
+                  <w:rPr>
+                    <w:rtl w:val="0"/>
+                  </w:rPr>
+                </w:r>
+              </w:p>
+            </w:tc>
+            <w:tc>
+              <w:tcPr>
+                <w:tcMar>
+                  <w:top w:w="0.0" w:type="dxa"/>
+                  <w:left w:w="100.0" w:type="dxa"/>
+                  <w:bottom w:w="0.0" w:type="dxa"/>
+                  <w:right w:w="100.0" w:type="dxa"/>
+                </w:tcMar>
+                <w:vAlign w:val="top"/>
+              </w:tcPr>
+              <w:p>
+                <w:pPr>
+                  <w:spacing w:after="0" w:line="276.0005454545455" w:lineRule="auto"/>
+                  <w:ind w:left="360" w:firstLine="0"/>
+                  <w:rPr>
+                    <w:sz w:val="24"/>
+                    <w:szCs w:val="24"/>
+                  </w:rPr>
+                </w:pPr>
+                <w:r>
+                  <w:rPr>
+                    <w:rtl w:val="0"/>
+                  </w:rPr>
+                </w:r>
+              </w:p>
+            </w:tc>
+          </w:tr>
+        </w:tbl>
+      </w:sdtContent>
+    </w:sdt>
+    <w:p>
+      <w:pPr>
+        <w:rPr>
+          <w:sz w:val="24"/>
+          <w:szCs w:val="24"/>
+        </w:rPr>
+      </w:pPr>
+      <w:r>
+        <w:rPr>
+          <w:sz w:val="24"/>
+          <w:szCs w:val="24"/>
+          <w:rtl w:val="0"/>
+        </w:rPr>
+        <w:t xml:space="preserve">{%p endif %}</w:t>
+      </w:r>
+    </w:p>
+    <w:p>
+      <w:pPr>
         <w:rPr>
           <w:b w:val="1"/>
           <w:bCs w:val="1"/>
@@ -5927,7 +6472,7 @@
       </w:r>
     </w:p>
     <w:sectPr>
-      <w:footerReference r:id="rId14" w:type="default"/>
+      <w:footerReference r:id="rId15" w:type="default"/>
       <w:pgSz w:h="15840" w:w="12240" w:orient="portrait"/>
       <w:pgMar w:bottom="1440" w:top="1440" w:left="1440" w:right="1440" w:header="720" w:footer="720"/>
       <w:pgNumType w:start="1"/>
@@ -6721,6 +7266,19 @@
       </w:tblCellMar>
     </w:tblPr>
   </w:style>
+  <w:style w:type="table" w:styleId="Table9">
+    <w:basedOn w:val="TableNormal"/>
+    <w:tblPr>
+      <w:tblStyleRowBandSize w:val="1"/>
+      <w:tblStyleColBandSize w:val="1"/>
+      <w:tblCellMar>
+        <w:top w:w="0.0" w:type="dxa"/>
+        <w:left w:w="115.0" w:type="dxa"/>
+        <w:bottom w:w="0.0" w:type="dxa"/>
+        <w:right w:w="115.0" w:type="dxa"/>
+      </w:tblCellMar>
+    </w:tblPr>
+  </w:style>
 </w:styles>
 </file>
 
@@ -7021,7 +7579,7 @@
 
 <file path=customXML/item1.xml><?xml version="1.0" encoding="utf-8"?>
 <go:gDocsCustomXmlDataStorage xmlns:go="http://customooxmlschemas.google.com/" xmlns:r="http://schemas.openxmlformats.org/officeDocument/2006/relationships" uri="GoogleDocsCustomDataVersion2">
-  <go:docsCustomData xmlns:go="http://customooxmlschemas.google.com/" roundtripDataSignature="AMtx7mioI9yMR6bbyGl+5dihtkJycUKlyQ==">CgMxLjAaHwoBMBIaChgICVIUChJ0YWJsZS5pdzZybjN6NWtmYTUaHwoBMRIaChgICVIUChJ0YWJsZS53dDc4Mm5iNG9ndW8aHwoBMhIaChgICVIUChJ0YWJsZS5oNHdweDBqMXJ1NjEaHwoBMxIaChgICVIUChJ0YWJsZS51N3ppYTR4OW9uOW0yDmguZ2JsczAxN2pzZWcyMg5oLjl1czByNnY3d3BoNjgAciExR1dqN0V5cEdpMTBZV0d4RU00RUpQUjlXR29QRjZGN28=</go:docsCustomData>
+  <go:docsCustomData xmlns:go="http://customooxmlschemas.google.com/" roundtripDataSignature="AMtx7mhQNsBy5gGcy+b/6tKBtCi/0ve8nQ==">CgMxLjAaHwoBMBIaChgICVIUChJ0YWJsZS5pdzZybjN6NWtmYTUaHwoBMRIaChgICVIUChJ0YWJsZS53dDc4Mm5iNG9ndW8aHwoBMhIaChgICVIUChJ0YWJsZS5oNHdweDBqMXJ1NjEaHwoBMxIaChgICVIUChJ0YWJsZS51N3ppYTR4OW9uOW0aHwoBNBIaChgICVIUChJ0YWJsZS56Y2NtczRydWZ3MjkyDmguZ2JsczAxN2pzZWcyMg5oLjl1czByNnY3d3BoNjgAciExR1dqN0V5cEdpMTBZV0d4RU00RUpQUjlXR29QRjZGN28=</go:docsCustomData>
 </go:gDocsCustomXmlDataStorage>
 </file>
 

</xml_diff>

<commit_message>
added Djole and Marina
</commit_message>
<xml_diff>
--- a/izveštaj_template.docx
+++ b/izveštaj_template.docx
@@ -14,12 +14,12 @@
           <wp:inline distB="0" distT="0" distL="0" distR="0">
             <wp:extent cx="5943600" cy="1435100"/>
             <wp:effectExtent b="0" l="0" r="0" t="0"/>
-            <wp:docPr descr="Graphical user interface, application&#10;&#10;Description automatically generated" id="13" name="image3.png"/>
+            <wp:docPr descr="Graphical user interface, application&#10;&#10;Description automatically generated" id="15" name="image6.png"/>
             <a:graphic>
               <a:graphicData uri="http://schemas.openxmlformats.org/drawingml/2006/picture">
                 <pic:pic>
                   <pic:nvPicPr>
-                    <pic:cNvPr descr="Graphical user interface, application&#10;&#10;Description automatically generated" id="0" name="image3.png"/>
+                    <pic:cNvPr descr="Graphical user interface, application&#10;&#10;Description automatically generated" id="0" name="image6.png"/>
                     <pic:cNvPicPr preferRelativeResize="0"/>
                   </pic:nvPicPr>
                   <pic:blipFill>
@@ -3717,12 +3717,12 @@
                 <wp:inline distB="0" distT="0" distL="0" distR="0">
                   <wp:extent cx="2076450" cy="438150"/>
                   <wp:effectExtent b="0" l="0" r="0" t="0"/>
-                  <wp:docPr descr="A close-up of a blue pen&#10;&#10;Description automatically generated" id="15" name="image5.jpg"/>
+                  <wp:docPr descr="A close-up of a blue pen&#10;&#10;Description automatically generated" id="18" name="image7.jpg"/>
                   <a:graphic>
                     <a:graphicData uri="http://schemas.openxmlformats.org/drawingml/2006/picture">
                       <pic:pic>
                         <pic:nvPicPr>
-                          <pic:cNvPr descr="A close-up of a blue pen&#10;&#10;Description automatically generated" id="0" name="image5.jpg"/>
+                          <pic:cNvPr descr="A close-up of a blue pen&#10;&#10;Description automatically generated" id="0" name="image7.jpg"/>
                           <pic:cNvPicPr preferRelativeResize="0"/>
                         </pic:nvPicPr>
                         <pic:blipFill>
@@ -3791,12 +3791,12 @@
                 <wp:inline distB="114300" distT="114300" distL="114300" distR="114300">
                   <wp:extent cx="1971675" cy="400050"/>
                   <wp:effectExtent b="0" l="0" r="0" t="0"/>
-                  <wp:docPr id="19" name="image6.png"/>
+                  <wp:docPr id="23" name="image3.png"/>
                   <a:graphic>
                     <a:graphicData uri="http://schemas.openxmlformats.org/drawingml/2006/picture">
                       <pic:pic>
                         <pic:nvPicPr>
-                          <pic:cNvPr id="0" name="image6.png"/>
+                          <pic:cNvPr id="0" name="image3.png"/>
                           <pic:cNvPicPr preferRelativeResize="0"/>
                         </pic:nvPicPr>
                         <pic:blipFill>
@@ -4036,7 +4036,7 @@
     <w:sdt>
       <w:sdtPr>
         <w:lock w:val="contentLocked"/>
-        <w:id w:val="-1028285277"/>
+        <w:id w:val="-182493033"/>
         <w:tag w:val="goog_rdk_0"/>
       </w:sdtPr>
       <w:sdtContent>
@@ -4098,12 +4098,12 @@
                     <wp:inline distB="0" distT="0" distL="0" distR="0">
                       <wp:extent cx="1769528" cy="548860"/>
                       <wp:effectExtent b="0" l="0" r="0" t="0"/>
-                      <wp:docPr id="21" name="image4.png"/>
+                      <wp:docPr id="27" name="image8.png"/>
                       <a:graphic>
                         <a:graphicData uri="http://schemas.openxmlformats.org/drawingml/2006/picture">
                           <pic:pic>
                             <pic:nvPicPr>
-                              <pic:cNvPr id="0" name="image4.png"/>
+                              <pic:cNvPr id="0" name="image8.png"/>
                               <pic:cNvPicPr preferRelativeResize="0"/>
                             </pic:nvPicPr>
                             <pic:blipFill>
@@ -4182,12 +4182,12 @@
                     <wp:inline distB="114300" distT="114300" distL="114300" distR="114300">
                       <wp:extent cx="1971675" cy="400050"/>
                       <wp:effectExtent b="0" l="0" r="0" t="0"/>
-                      <wp:docPr id="11" name="image6.png"/>
+                      <wp:docPr id="13" name="image3.png"/>
                       <a:graphic>
                         <a:graphicData uri="http://schemas.openxmlformats.org/drawingml/2006/picture">
                           <pic:pic>
                             <pic:nvPicPr>
-                              <pic:cNvPr id="0" name="image6.png"/>
+                              <pic:cNvPr id="0" name="image3.png"/>
                               <pic:cNvPicPr preferRelativeResize="0"/>
                             </pic:nvPicPr>
                             <pic:blipFill>
@@ -4441,7 +4441,7 @@
     <w:sdt>
       <w:sdtPr>
         <w:lock w:val="contentLocked"/>
-        <w:id w:val="683180343"/>
+        <w:id w:val="-2105833693"/>
         <w:tag w:val="goog_rdk_1"/>
       </w:sdtPr>
       <w:sdtContent>
@@ -4506,12 +4506,12 @@
                     <wp:inline distB="0" distT="0" distL="0" distR="0">
                       <wp:extent cx="1614488" cy="563789"/>
                       <wp:effectExtent b="0" l="0" r="0" t="0"/>
-                      <wp:docPr id="24" name="image1.png"/>
+                      <wp:docPr id="30" name="image11.png"/>
                       <a:graphic>
                         <a:graphicData uri="http://schemas.openxmlformats.org/drawingml/2006/picture">
                           <pic:pic>
                             <pic:nvPicPr>
-                              <pic:cNvPr id="0" name="image1.png"/>
+                              <pic:cNvPr id="0" name="image11.png"/>
                               <pic:cNvPicPr preferRelativeResize="0"/>
                             </pic:nvPicPr>
                             <pic:blipFill>
@@ -4590,12 +4590,12 @@
                     <wp:inline distB="114300" distT="114300" distL="114300" distR="114300">
                       <wp:extent cx="1971675" cy="400050"/>
                       <wp:effectExtent b="0" l="0" r="0" t="0"/>
-                      <wp:docPr id="16" name="image6.png"/>
+                      <wp:docPr id="19" name="image3.png"/>
                       <a:graphic>
                         <a:graphicData uri="http://schemas.openxmlformats.org/drawingml/2006/picture">
                           <pic:pic>
                             <pic:nvPicPr>
-                              <pic:cNvPr id="0" name="image6.png"/>
+                              <pic:cNvPr id="0" name="image3.png"/>
                               <pic:cNvPicPr preferRelativeResize="0"/>
                             </pic:nvPicPr>
                             <pic:blipFill>
@@ -4849,7 +4849,7 @@
     <w:sdt>
       <w:sdtPr>
         <w:lock w:val="contentLocked"/>
-        <w:id w:val="419270247"/>
+        <w:id w:val="-1689978118"/>
         <w:tag w:val="goog_rdk_2"/>
       </w:sdtPr>
       <w:sdtContent>
@@ -4911,12 +4911,12 @@
                     <wp:inline distB="0" distT="0" distL="0" distR="0">
                       <wp:extent cx="1571239" cy="601917"/>
                       <wp:effectExtent b="0" l="0" r="0" t="0"/>
-                      <wp:docPr id="14" name="image8.png"/>
+                      <wp:docPr id="17" name="image5.png"/>
                       <a:graphic>
                         <a:graphicData uri="http://schemas.openxmlformats.org/drawingml/2006/picture">
                           <pic:pic>
                             <pic:nvPicPr>
-                              <pic:cNvPr id="0" name="image8.png"/>
+                              <pic:cNvPr id="0" name="image5.png"/>
                               <pic:cNvPicPr preferRelativeResize="0"/>
                             </pic:nvPicPr>
                             <pic:blipFill>
@@ -4995,12 +4995,12 @@
                     <wp:inline distB="114300" distT="114300" distL="114300" distR="114300">
                       <wp:extent cx="1971675" cy="400050"/>
                       <wp:effectExtent b="0" l="0" r="0" t="0"/>
-                      <wp:docPr id="12" name="image6.png"/>
+                      <wp:docPr id="14" name="image3.png"/>
                       <a:graphic>
                         <a:graphicData uri="http://schemas.openxmlformats.org/drawingml/2006/picture">
                           <pic:pic>
                             <pic:nvPicPr>
-                              <pic:cNvPr id="0" name="image6.png"/>
+                              <pic:cNvPr id="0" name="image3.png"/>
                               <pic:cNvPicPr preferRelativeResize="0"/>
                             </pic:nvPicPr>
                             <pic:blipFill>
@@ -5254,7 +5254,7 @@
     <w:sdt>
       <w:sdtPr>
         <w:lock w:val="contentLocked"/>
-        <w:id w:val="460589908"/>
+        <w:id w:val="-716454974"/>
         <w:tag w:val="goog_rdk_3"/>
       </w:sdtPr>
       <w:sdtContent>
@@ -5319,12 +5319,12 @@
                     <wp:inline distB="114300" distT="114300" distL="114300" distR="114300">
                       <wp:extent cx="701662" cy="1452563"/>
                       <wp:effectExtent b="0" l="0" r="0" t="0"/>
-                      <wp:docPr id="18" name="image2.jpg"/>
+                      <wp:docPr id="22" name="image10.jpg"/>
                       <a:graphic>
                         <a:graphicData uri="http://schemas.openxmlformats.org/drawingml/2006/picture">
                           <pic:pic>
                             <pic:nvPicPr>
-                              <pic:cNvPr id="0" name="image2.jpg"/>
+                              <pic:cNvPr id="0" name="image10.jpg"/>
                               <pic:cNvPicPr preferRelativeResize="0"/>
                             </pic:nvPicPr>
                             <pic:blipFill>
@@ -5403,12 +5403,12 @@
                     <wp:inline distB="114300" distT="114300" distL="114300" distR="114300">
                       <wp:extent cx="1971675" cy="400050"/>
                       <wp:effectExtent b="0" l="0" r="0" t="0"/>
-                      <wp:docPr id="22" name="image6.png"/>
+                      <wp:docPr id="28" name="image3.png"/>
                       <a:graphic>
                         <a:graphicData uri="http://schemas.openxmlformats.org/drawingml/2006/picture">
                           <pic:pic>
                             <pic:nvPicPr>
-                              <pic:cNvPr id="0" name="image6.png"/>
+                              <pic:cNvPr id="0" name="image3.png"/>
                               <pic:cNvPicPr preferRelativeResize="0"/>
                             </pic:nvPicPr>
                             <pic:blipFill>
@@ -5662,7 +5662,7 @@
     <w:sdt>
       <w:sdtPr>
         <w:lock w:val="contentLocked"/>
-        <w:id w:val="1064413408"/>
+        <w:id w:val="-658792564"/>
         <w:tag w:val="goog_rdk_4"/>
       </w:sdtPr>
       <w:sdtContent>
@@ -5724,12 +5724,12 @@
                     <wp:inline distB="0" distT="0" distL="0" distR="0">
                       <wp:extent cx="1571239" cy="601917"/>
                       <wp:effectExtent b="0" l="0" r="0" t="0"/>
-                      <wp:docPr id="17" name="image8.png"/>
+                      <wp:docPr id="21" name="image5.png"/>
                       <a:graphic>
                         <a:graphicData uri="http://schemas.openxmlformats.org/drawingml/2006/picture">
                           <pic:pic>
                             <pic:nvPicPr>
-                              <pic:cNvPr id="0" name="image8.png"/>
+                              <pic:cNvPr id="0" name="image5.png"/>
                               <pic:cNvPicPr preferRelativeResize="0"/>
                             </pic:nvPicPr>
                             <pic:blipFill>
@@ -5808,12 +5808,12 @@
                     <wp:inline distB="114300" distT="114300" distL="114300" distR="114300">
                       <wp:extent cx="1971675" cy="400050"/>
                       <wp:effectExtent b="0" l="0" r="0" t="0"/>
-                      <wp:docPr id="20" name="image6.png"/>
+                      <wp:docPr id="26" name="image3.png"/>
                       <a:graphic>
                         <a:graphicData uri="http://schemas.openxmlformats.org/drawingml/2006/picture">
                           <pic:pic>
                             <pic:nvPicPr>
-                              <pic:cNvPr id="0" name="image6.png"/>
+                              <pic:cNvPr id="0" name="image3.png"/>
                               <pic:cNvPicPr preferRelativeResize="0"/>
                             </pic:nvPicPr>
                             <pic:blipFill>
@@ -5992,12 +5992,12 @@
                     <wp:inline distB="0" distT="0" distL="0" distR="0">
                       <wp:extent cx="476868" cy="1228845"/>
                       <wp:effectExtent b="0" l="0" r="0" t="0"/>
-                      <wp:docPr id="23" name="image7.png"/>
+                      <wp:docPr id="29" name="image12.png"/>
                       <a:graphic>
                         <a:graphicData uri="http://schemas.openxmlformats.org/drawingml/2006/picture">
                           <pic:pic>
                             <pic:nvPicPr>
-                              <pic:cNvPr id="0" name="image7.png"/>
+                              <pic:cNvPr id="0" name="image12.png"/>
                               <pic:cNvPicPr preferRelativeResize="0"/>
                             </pic:nvPicPr>
                             <pic:blipFill>
@@ -6133,6 +6133,1078 @@
     </w:p>
     <w:p>
       <w:pPr>
+        <w:tabs>
+          <w:tab w:val="left" w:leader="none" w:pos="0"/>
+        </w:tabs>
+        <w:spacing w:after="200" w:before="200" w:line="276" w:lineRule="auto"/>
+        <w:jc w:val="both"/>
+        <w:rPr>
+          <w:sz w:val="24"/>
+          <w:szCs w:val="24"/>
+        </w:rPr>
+      </w:pPr>
+      <w:r>
+        <w:rPr>
+          <w:sz w:val="24"/>
+          <w:szCs w:val="24"/>
+          <w:rtl w:val="0"/>
+        </w:rPr>
+        <w:t xml:space="preserve">{%p if analizator == </w:t>
+      </w:r>
+      <w:r>
+        <w:rPr>
+          <w:sz w:val="24"/>
+          <w:szCs w:val="24"/>
+          <w:highlight w:val="white"/>
+          <w:rtl w:val="0"/>
+        </w:rPr>
+        <w:t xml:space="preserve">"</w:t>
+      </w:r>
+      <w:r>
+        <w:rPr>
+          <w:sz w:val="24"/>
+          <w:szCs w:val="24"/>
+          <w:rtl w:val="0"/>
+        </w:rPr>
+        <w:t xml:space="preserve">Đole</w:t>
+      </w:r>
+      <w:r>
+        <w:rPr>
+          <w:sz w:val="24"/>
+          <w:szCs w:val="24"/>
+          <w:highlight w:val="white"/>
+          <w:rtl w:val="0"/>
+        </w:rPr>
+        <w:t xml:space="preserve">"</w:t>
+      </w:r>
+      <w:r>
+        <w:rPr>
+          <w:sz w:val="24"/>
+          <w:szCs w:val="24"/>
+          <w:rtl w:val="0"/>
+        </w:rPr>
+        <w:t xml:space="preserve"> %}</w:t>
+      </w:r>
+    </w:p>
+    <w:p>
+      <w:pPr>
+        <w:tabs>
+          <w:tab w:val="left" w:leader="none" w:pos="0"/>
+        </w:tabs>
+        <w:spacing w:after="200" w:before="200" w:line="276" w:lineRule="auto"/>
+        <w:jc w:val="both"/>
+        <w:rPr>
+          <w:sz w:val="24"/>
+          <w:szCs w:val="24"/>
+        </w:rPr>
+      </w:pPr>
+      <w:r>
+        <w:rPr>
+          <w:rtl w:val="0"/>
+        </w:rPr>
+      </w:r>
+    </w:p>
+    <w:tbl>
+      <w:tblPr>
+        <w:tblStyle w:val="Table10"/>
+        <w:tblW w:w="9270.0" w:type="dxa"/>
+        <w:jc w:val="center"/>
+        <w:tblLayout w:type="fixed"/>
+        <w:tblLook w:val="0400"/>
+      </w:tblPr>
+      <w:tblGrid>
+        <w:gridCol w:w="4635"/>
+        <w:gridCol w:w="4635"/>
+        <w:tblGridChange w:id="0">
+          <w:tblGrid>
+            <w:gridCol w:w="4635"/>
+            <w:gridCol w:w="4635"/>
+          </w:tblGrid>
+        </w:tblGridChange>
+      </w:tblGrid>
+      <w:tr>
+        <w:trPr>
+          <w:cantSplit w:val="0"/>
+          <w:tblHeader w:val="0"/>
+        </w:trPr>
+        <w:tc>
+          <w:tcPr/>
+          <w:p>
+            <w:pPr>
+              <w:spacing w:after="0" w:line="240" w:lineRule="auto"/>
+              <w:rPr>
+                <w:sz w:val="24"/>
+                <w:szCs w:val="24"/>
+              </w:rPr>
+            </w:pPr>
+            <w:bookmarkStart w:colFirst="0" w:colLast="0" w:name="_heading=h.9us0r6v7wph6" w:id="1"/>
+            <w:bookmarkEnd w:id="1"/>
+            <w:r>
+              <w:rPr>
+                <w:sz w:val="24"/>
+                <w:szCs w:val="24"/>
+                <w:rtl w:val="0"/>
+              </w:rPr>
+              <w:t xml:space="preserve">Analizu izvršili</w:t>
+            </w:r>
+          </w:p>
+          <w:p>
+            <w:pPr>
+              <w:spacing w:after="0" w:line="240" w:lineRule="auto"/>
+              <w:rPr>
+                <w:sz w:val="24"/>
+                <w:szCs w:val="24"/>
+              </w:rPr>
+            </w:pPr>
+            <w:r>
+              <w:rPr/>
+              <w:drawing>
+                <wp:inline distB="0" distT="0" distL="0" distR="0">
+                  <wp:extent cx="1495425" cy="504825"/>
+                  <wp:effectExtent b="0" l="0" r="0" t="0"/>
+                  <wp:docPr id="16" name="image1.png"/>
+                  <a:graphic>
+                    <a:graphicData uri="http://schemas.openxmlformats.org/drawingml/2006/picture">
+                      <pic:pic>
+                        <pic:nvPicPr>
+                          <pic:cNvPr id="0" name="image1.png"/>
+                          <pic:cNvPicPr preferRelativeResize="0"/>
+                        </pic:nvPicPr>
+                        <pic:blipFill>
+                          <a:blip r:embed="rId15"/>
+                          <a:srcRect b="0" l="15299" r="26119" t="0"/>
+                          <a:stretch>
+                            <a:fillRect/>
+                          </a:stretch>
+                        </pic:blipFill>
+                        <pic:spPr>
+                          <a:xfrm>
+                            <a:off x="0" y="0"/>
+                            <a:ext cx="1495425" cy="504825"/>
+                          </a:xfrm>
+                          <a:prstGeom prst="rect"/>
+                          <a:ln/>
+                        </pic:spPr>
+                      </pic:pic>
+                    </a:graphicData>
+                  </a:graphic>
+                </wp:inline>
+              </w:drawing>
+            </w:r>
+            <w:r>
+              <w:rPr>
+                <w:rtl w:val="0"/>
+              </w:rPr>
+            </w:r>
+          </w:p>
+        </w:tc>
+        <w:tc>
+          <w:tcPr/>
+          <w:p>
+            <w:pPr>
+              <w:spacing w:after="0" w:line="240" w:lineRule="auto"/>
+              <w:rPr>
+                <w:sz w:val="24"/>
+                <w:szCs w:val="24"/>
+              </w:rPr>
+            </w:pPr>
+            <w:r>
+              <w:rPr>
+                <w:sz w:val="24"/>
+                <w:szCs w:val="24"/>
+                <w:rtl w:val="0"/>
+              </w:rPr>
+              <w:t xml:space="preserve">Odgovorna osoba</w:t>
+            </w:r>
+          </w:p>
+          <w:p>
+            <w:pPr>
+              <w:spacing w:after="0" w:line="276" w:lineRule="auto"/>
+              <w:jc w:val="both"/>
+              <w:rPr>
+                <w:sz w:val="24"/>
+                <w:szCs w:val="24"/>
+              </w:rPr>
+            </w:pPr>
+            <w:r>
+              <w:rPr>
+                <w:sz w:val="24"/>
+                <w:szCs w:val="24"/>
+              </w:rPr>
+              <w:drawing>
+                <wp:inline distB="0" distT="0" distL="0" distR="0">
+                  <wp:extent cx="1971675" cy="400050"/>
+                  <wp:effectExtent b="0" l="0" r="0" t="0"/>
+                  <wp:docPr id="24" name="image4.png"/>
+                  <a:graphic>
+                    <a:graphicData uri="http://schemas.openxmlformats.org/drawingml/2006/picture">
+                      <pic:pic>
+                        <pic:nvPicPr>
+                          <pic:cNvPr id="0" name="image4.png"/>
+                          <pic:cNvPicPr preferRelativeResize="0"/>
+                        </pic:nvPicPr>
+                        <pic:blipFill>
+                          <a:blip r:embed="rId9"/>
+                          <a:srcRect b="0" l="0" r="0" t="0"/>
+                          <a:stretch>
+                            <a:fillRect/>
+                          </a:stretch>
+                        </pic:blipFill>
+                        <pic:spPr>
+                          <a:xfrm>
+                            <a:off x="0" y="0"/>
+                            <a:ext cx="1971675" cy="400050"/>
+                          </a:xfrm>
+                          <a:prstGeom prst="rect"/>
+                          <a:ln/>
+                        </pic:spPr>
+                      </pic:pic>
+                    </a:graphicData>
+                  </a:graphic>
+                </wp:inline>
+              </w:drawing>
+            </w:r>
+            <w:r>
+              <w:rPr>
+                <w:rtl w:val="0"/>
+              </w:rPr>
+            </w:r>
+          </w:p>
+        </w:tc>
+      </w:tr>
+      <w:tr>
+        <w:trPr>
+          <w:cantSplit w:val="0"/>
+          <w:tblHeader w:val="0"/>
+        </w:trPr>
+        <w:tc>
+          <w:tcPr/>
+          <w:p>
+            <w:pPr>
+              <w:spacing w:after="0" w:line="240" w:lineRule="auto"/>
+              <w:jc w:val="both"/>
+              <w:rPr>
+                <w:sz w:val="24"/>
+                <w:szCs w:val="24"/>
+              </w:rPr>
+            </w:pPr>
+            <w:r>
+              <w:rPr>
+                <w:sz w:val="24"/>
+                <w:szCs w:val="24"/>
+                <w:rtl w:val="0"/>
+              </w:rPr>
+              <w:t xml:space="preserve">Đorđe Pavlović</w:t>
+            </w:r>
+          </w:p>
+          <w:p>
+            <w:pPr>
+              <w:spacing w:after="0" w:line="240" w:lineRule="auto"/>
+              <w:rPr>
+                <w:sz w:val="24"/>
+                <w:szCs w:val="24"/>
+              </w:rPr>
+            </w:pPr>
+            <w:r>
+              <w:rPr>
+                <w:sz w:val="24"/>
+                <w:szCs w:val="24"/>
+                <w:rtl w:val="0"/>
+              </w:rPr>
+              <w:t xml:space="preserve">Institut za molekularnu genetiku</w:t>
+            </w:r>
+          </w:p>
+          <w:p>
+            <w:pPr>
+              <w:spacing w:after="0" w:line="240" w:lineRule="auto"/>
+              <w:rPr>
+                <w:sz w:val="24"/>
+                <w:szCs w:val="24"/>
+              </w:rPr>
+            </w:pPr>
+            <w:r>
+              <w:rPr>
+                <w:sz w:val="24"/>
+                <w:szCs w:val="24"/>
+                <w:rtl w:val="0"/>
+              </w:rPr>
+              <w:t xml:space="preserve">i genetičko inženjerstvo</w:t>
+            </w:r>
+          </w:p>
+          <w:p>
+            <w:pPr>
+              <w:spacing w:after="0" w:line="240" w:lineRule="auto"/>
+              <w:rPr/>
+            </w:pPr>
+            <w:r>
+              <w:rPr>
+                <w:rtl w:val="0"/>
+              </w:rPr>
+            </w:r>
+          </w:p>
+        </w:tc>
+        <w:tc>
+          <w:tcPr/>
+          <w:p>
+            <w:pPr>
+              <w:spacing w:after="0" w:line="240" w:lineRule="auto"/>
+              <w:rPr>
+                <w:sz w:val="24"/>
+                <w:szCs w:val="24"/>
+              </w:rPr>
+            </w:pPr>
+            <w:r>
+              <w:rPr>
+                <w:sz w:val="24"/>
+                <w:szCs w:val="24"/>
+                <w:rtl w:val="0"/>
+              </w:rPr>
+              <w:t xml:space="preserve">dr Marina Anđelković Nikolić</w:t>
+            </w:r>
+          </w:p>
+          <w:p>
+            <w:pPr>
+              <w:spacing w:after="0" w:line="240" w:lineRule="auto"/>
+              <w:rPr>
+                <w:sz w:val="24"/>
+                <w:szCs w:val="24"/>
+              </w:rPr>
+            </w:pPr>
+            <w:r>
+              <w:rPr>
+                <w:sz w:val="24"/>
+                <w:szCs w:val="24"/>
+                <w:rtl w:val="0"/>
+              </w:rPr>
+              <w:t xml:space="preserve">Institut za molekularnu genetiku</w:t>
+            </w:r>
+          </w:p>
+          <w:p>
+            <w:pPr>
+              <w:spacing w:after="0" w:line="240" w:lineRule="auto"/>
+              <w:rPr>
+                <w:sz w:val="24"/>
+                <w:szCs w:val="24"/>
+              </w:rPr>
+            </w:pPr>
+            <w:r>
+              <w:rPr>
+                <w:sz w:val="24"/>
+                <w:szCs w:val="24"/>
+                <w:rtl w:val="0"/>
+              </w:rPr>
+              <w:t xml:space="preserve">i genetičko inženjerstvo</w:t>
+            </w:r>
+          </w:p>
+        </w:tc>
+      </w:tr>
+      <w:tr>
+        <w:trPr>
+          <w:cantSplit w:val="0"/>
+          <w:tblHeader w:val="0"/>
+        </w:trPr>
+        <w:tc>
+          <w:tcPr/>
+          <w:p>
+            <w:pPr>
+              <w:spacing w:after="0" w:line="240" w:lineRule="auto"/>
+              <w:rPr/>
+            </w:pPr>
+            <w:r>
+              <w:rPr/>
+              <w:drawing>
+                <wp:inline distB="0" distT="0" distL="0" distR="0">
+                  <wp:extent cx="2076449" cy="438149"/>
+                  <wp:effectExtent b="0" l="0" r="0" t="0"/>
+                  <wp:docPr descr="A close-up of a blue pen&#10;&#10;Description automatically generated" id="25" name="image2.jpg"/>
+                  <a:graphic>
+                    <a:graphicData uri="http://schemas.openxmlformats.org/drawingml/2006/picture">
+                      <pic:pic>
+                        <pic:nvPicPr>
+                          <pic:cNvPr descr="A close-up of a blue pen&#10;&#10;Description automatically generated" id="0" name="image2.jpg"/>
+                          <pic:cNvPicPr preferRelativeResize="0"/>
+                        </pic:nvPicPr>
+                        <pic:blipFill>
+                          <a:blip r:embed="rId16"/>
+                          <a:srcRect b="11406" l="0" r="0" t="18312"/>
+                          <a:stretch>
+                            <a:fillRect/>
+                          </a:stretch>
+                        </pic:blipFill>
+                        <pic:spPr>
+                          <a:xfrm>
+                            <a:off x="0" y="0"/>
+                            <a:ext cx="2076449" cy="438149"/>
+                          </a:xfrm>
+                          <a:prstGeom prst="rect"/>
+                          <a:ln/>
+                        </pic:spPr>
+                      </pic:pic>
+                    </a:graphicData>
+                  </a:graphic>
+                </wp:inline>
+              </w:drawing>
+            </w:r>
+            <w:r>
+              <w:rPr>
+                <w:rtl w:val="0"/>
+              </w:rPr>
+            </w:r>
+          </w:p>
+        </w:tc>
+        <w:tc>
+          <w:tcPr/>
+          <w:p>
+            <w:pPr>
+              <w:spacing w:after="0" w:line="240" w:lineRule="auto"/>
+              <w:rPr>
+                <w:sz w:val="24"/>
+                <w:szCs w:val="24"/>
+              </w:rPr>
+            </w:pPr>
+            <w:r>
+              <w:rPr>
+                <w:rtl w:val="0"/>
+              </w:rPr>
+            </w:r>
+          </w:p>
+        </w:tc>
+      </w:tr>
+      <w:tr>
+        <w:trPr>
+          <w:cantSplit w:val="0"/>
+          <w:tblHeader w:val="0"/>
+        </w:trPr>
+        <w:tc>
+          <w:tcPr/>
+          <w:p>
+            <w:pPr>
+              <w:spacing w:after="0" w:line="240" w:lineRule="auto"/>
+              <w:jc w:val="both"/>
+              <w:rPr>
+                <w:sz w:val="24"/>
+                <w:szCs w:val="24"/>
+              </w:rPr>
+            </w:pPr>
+            <w:r>
+              <w:rPr>
+                <w:sz w:val="24"/>
+                <w:szCs w:val="24"/>
+                <w:rtl w:val="0"/>
+              </w:rPr>
+              <w:t xml:space="preserve">dr Kristel Klaassen Ljubičić</w:t>
+            </w:r>
+          </w:p>
+          <w:p>
+            <w:pPr>
+              <w:spacing w:after="0" w:line="240" w:lineRule="auto"/>
+              <w:rPr>
+                <w:sz w:val="24"/>
+                <w:szCs w:val="24"/>
+              </w:rPr>
+            </w:pPr>
+            <w:r>
+              <w:rPr>
+                <w:sz w:val="24"/>
+                <w:szCs w:val="24"/>
+                <w:rtl w:val="0"/>
+              </w:rPr>
+              <w:t xml:space="preserve">Institut za molekularnu genetiku</w:t>
+            </w:r>
+          </w:p>
+          <w:p>
+            <w:pPr>
+              <w:spacing w:after="0" w:line="240" w:lineRule="auto"/>
+              <w:rPr>
+                <w:sz w:val="24"/>
+                <w:szCs w:val="24"/>
+              </w:rPr>
+            </w:pPr>
+            <w:r>
+              <w:rPr>
+                <w:sz w:val="24"/>
+                <w:szCs w:val="24"/>
+                <w:rtl w:val="0"/>
+              </w:rPr>
+              <w:t xml:space="preserve">i genetičko inženjerstvo</w:t>
+            </w:r>
+          </w:p>
+        </w:tc>
+        <w:tc>
+          <w:tcPr/>
+          <w:p>
+            <w:pPr>
+              <w:rPr/>
+            </w:pPr>
+            <w:r>
+              <w:rPr>
+                <w:rtl w:val="0"/>
+              </w:rPr>
+            </w:r>
+          </w:p>
+        </w:tc>
+      </w:tr>
+    </w:tbl>
+    <w:p>
+      <w:pPr>
+        <w:rPr>
+          <w:sz w:val="24"/>
+          <w:szCs w:val="24"/>
+        </w:rPr>
+      </w:pPr>
+      <w:r>
+        <w:rPr>
+          <w:sz w:val="24"/>
+          <w:szCs w:val="24"/>
+          <w:rtl w:val="0"/>
+        </w:rPr>
+        <w:t xml:space="preserve">{%p endif %}</w:t>
+      </w:r>
+    </w:p>
+    <w:p>
+      <w:pPr>
+        <w:tabs>
+          <w:tab w:val="left" w:leader="none" w:pos="0"/>
+        </w:tabs>
+        <w:spacing w:after="200" w:before="200" w:line="276" w:lineRule="auto"/>
+        <w:jc w:val="both"/>
+        <w:rPr>
+          <w:sz w:val="24"/>
+          <w:szCs w:val="24"/>
+        </w:rPr>
+      </w:pPr>
+      <w:r>
+        <w:rPr>
+          <w:sz w:val="24"/>
+          <w:szCs w:val="24"/>
+          <w:rtl w:val="0"/>
+        </w:rPr>
+        <w:t xml:space="preserve">{%p if analizator == </w:t>
+      </w:r>
+      <w:r>
+        <w:rPr>
+          <w:sz w:val="24"/>
+          <w:szCs w:val="24"/>
+          <w:highlight w:val="white"/>
+          <w:rtl w:val="0"/>
+        </w:rPr>
+        <w:t xml:space="preserve">"</w:t>
+      </w:r>
+      <w:r>
+        <w:rPr>
+          <w:sz w:val="24"/>
+          <w:szCs w:val="24"/>
+          <w:rtl w:val="0"/>
+        </w:rPr>
+        <w:t xml:space="preserve">Marina</w:t>
+      </w:r>
+      <w:r>
+        <w:rPr>
+          <w:sz w:val="24"/>
+          <w:szCs w:val="24"/>
+          <w:highlight w:val="white"/>
+          <w:rtl w:val="0"/>
+        </w:rPr>
+        <w:t xml:space="preserve">"</w:t>
+      </w:r>
+      <w:r>
+        <w:rPr>
+          <w:sz w:val="24"/>
+          <w:szCs w:val="24"/>
+          <w:rtl w:val="0"/>
+        </w:rPr>
+        <w:t xml:space="preserve"> %}</w:t>
+      </w:r>
+    </w:p>
+    <w:p>
+      <w:pPr>
+        <w:tabs>
+          <w:tab w:val="left" w:leader="none" w:pos="0"/>
+        </w:tabs>
+        <w:spacing w:after="200" w:before="200" w:line="276" w:lineRule="auto"/>
+        <w:jc w:val="both"/>
+        <w:rPr>
+          <w:sz w:val="24"/>
+          <w:szCs w:val="24"/>
+        </w:rPr>
+      </w:pPr>
+      <w:r>
+        <w:rPr>
+          <w:rtl w:val="0"/>
+        </w:rPr>
+      </w:r>
+    </w:p>
+    <w:sdt>
+      <w:sdtPr>
+        <w:lock w:val="contentLocked"/>
+        <w:id w:val="-1303092612"/>
+        <w:tag w:val="goog_rdk_5"/>
+      </w:sdtPr>
+      <w:sdtContent>
+        <w:tbl>
+          <w:tblPr>
+            <w:tblStyle w:val="Table11"/>
+            <w:tblW w:w="9270.0" w:type="dxa"/>
+            <w:jc w:val="center"/>
+            <w:tblLayout w:type="fixed"/>
+            <w:tblLook w:val="0400"/>
+          </w:tblPr>
+          <w:tblGrid>
+            <w:gridCol w:w="4635"/>
+            <w:gridCol w:w="4635"/>
+            <w:tblGridChange w:id="0">
+              <w:tblGrid>
+                <w:gridCol w:w="4635"/>
+                <w:gridCol w:w="4635"/>
+              </w:tblGrid>
+            </w:tblGridChange>
+          </w:tblGrid>
+          <w:tr>
+            <w:trPr>
+              <w:cantSplit w:val="0"/>
+              <w:tblHeader w:val="0"/>
+            </w:trPr>
+            <w:tc>
+              <w:tcPr/>
+              <w:p>
+                <w:pPr>
+                  <w:spacing w:after="0" w:line="240" w:lineRule="auto"/>
+                  <w:rPr>
+                    <w:sz w:val="24"/>
+                    <w:szCs w:val="24"/>
+                  </w:rPr>
+                </w:pPr>
+                <w:bookmarkStart w:colFirst="0" w:colLast="0" w:name="_heading=h.9us0r6v7wph6" w:id="1"/>
+                <w:bookmarkEnd w:id="1"/>
+                <w:r>
+                  <w:rPr>
+                    <w:sz w:val="24"/>
+                    <w:szCs w:val="24"/>
+                    <w:rtl w:val="0"/>
+                  </w:rPr>
+                  <w:t xml:space="preserve">Analizu izvršili</w:t>
+                </w:r>
+              </w:p>
+              <w:p>
+                <w:pPr>
+                  <w:spacing w:after="0" w:line="240" w:lineRule="auto"/>
+                  <w:rPr>
+                    <w:sz w:val="24"/>
+                    <w:szCs w:val="24"/>
+                  </w:rPr>
+                </w:pPr>
+                <w:r>
+                  <w:rPr>
+                    <w:sz w:val="24"/>
+                    <w:szCs w:val="24"/>
+                  </w:rPr>
+                  <w:drawing>
+                    <wp:inline distB="0" distT="0" distL="0" distR="0">
+                      <wp:extent cx="1300163" cy="675084"/>
+                      <wp:effectExtent b="0" l="0" r="0" t="0"/>
+                      <wp:docPr id="12" name="image9.png"/>
+                      <a:graphic>
+                        <a:graphicData uri="http://schemas.openxmlformats.org/drawingml/2006/picture">
+                          <pic:pic>
+                            <pic:nvPicPr>
+                              <pic:cNvPr id="0" name="image9.png"/>
+                              <pic:cNvPicPr preferRelativeResize="0"/>
+                            </pic:nvPicPr>
+                            <pic:blipFill>
+                              <a:blip r:embed="rId17"/>
+                              <a:srcRect b="0" l="0" r="0" t="0"/>
+                              <a:stretch>
+                                <a:fillRect/>
+                              </a:stretch>
+                            </pic:blipFill>
+                            <pic:spPr>
+                              <a:xfrm>
+                                <a:off x="0" y="0"/>
+                                <a:ext cx="1300163" cy="675084"/>
+                              </a:xfrm>
+                              <a:prstGeom prst="rect"/>
+                              <a:ln/>
+                            </pic:spPr>
+                          </pic:pic>
+                        </a:graphicData>
+                      </a:graphic>
+                    </wp:inline>
+                  </w:drawing>
+                </w:r>
+                <w:r>
+                  <w:rPr>
+                    <w:rtl w:val="0"/>
+                  </w:rPr>
+                </w:r>
+              </w:p>
+            </w:tc>
+            <w:tc>
+              <w:tcPr/>
+              <w:p>
+                <w:pPr>
+                  <w:spacing w:after="0" w:line="240" w:lineRule="auto"/>
+                  <w:rPr>
+                    <w:sz w:val="24"/>
+                    <w:szCs w:val="24"/>
+                  </w:rPr>
+                </w:pPr>
+                <w:r>
+                  <w:rPr>
+                    <w:sz w:val="24"/>
+                    <w:szCs w:val="24"/>
+                    <w:rtl w:val="0"/>
+                  </w:rPr>
+                  <w:t xml:space="preserve">Odgovorna osoba</w:t>
+                </w:r>
+              </w:p>
+              <w:p>
+                <w:pPr>
+                  <w:spacing w:after="0" w:line="276" w:lineRule="auto"/>
+                  <w:jc w:val="both"/>
+                  <w:rPr>
+                    <w:sz w:val="24"/>
+                    <w:szCs w:val="24"/>
+                  </w:rPr>
+                </w:pPr>
+                <w:r>
+                  <w:rPr>
+                    <w:sz w:val="24"/>
+                    <w:szCs w:val="24"/>
+                  </w:rPr>
+                  <w:drawing>
+                    <wp:inline distB="0" distT="0" distL="0" distR="0">
+                      <wp:extent cx="1971675" cy="400050"/>
+                      <wp:effectExtent b="0" l="0" r="0" t="0"/>
+                      <wp:docPr id="11" name="image4.png"/>
+                      <a:graphic>
+                        <a:graphicData uri="http://schemas.openxmlformats.org/drawingml/2006/picture">
+                          <pic:pic>
+                            <pic:nvPicPr>
+                              <pic:cNvPr id="0" name="image4.png"/>
+                              <pic:cNvPicPr preferRelativeResize="0"/>
+                            </pic:nvPicPr>
+                            <pic:blipFill>
+                              <a:blip r:embed="rId9"/>
+                              <a:srcRect b="0" l="0" r="0" t="0"/>
+                              <a:stretch>
+                                <a:fillRect/>
+                              </a:stretch>
+                            </pic:blipFill>
+                            <pic:spPr>
+                              <a:xfrm>
+                                <a:off x="0" y="0"/>
+                                <a:ext cx="1971675" cy="400050"/>
+                              </a:xfrm>
+                              <a:prstGeom prst="rect"/>
+                              <a:ln/>
+                            </pic:spPr>
+                          </pic:pic>
+                        </a:graphicData>
+                      </a:graphic>
+                    </wp:inline>
+                  </w:drawing>
+                </w:r>
+                <w:r>
+                  <w:rPr>
+                    <w:rtl w:val="0"/>
+                  </w:rPr>
+                </w:r>
+              </w:p>
+            </w:tc>
+          </w:tr>
+          <w:tr>
+            <w:trPr>
+              <w:cantSplit w:val="0"/>
+              <w:tblHeader w:val="0"/>
+            </w:trPr>
+            <w:tc>
+              <w:tcPr/>
+              <w:p>
+                <w:pPr>
+                  <w:spacing w:after="0" w:line="240" w:lineRule="auto"/>
+                  <w:jc w:val="both"/>
+                  <w:rPr>
+                    <w:sz w:val="24"/>
+                    <w:szCs w:val="24"/>
+                  </w:rPr>
+                </w:pPr>
+                <w:r>
+                  <w:rPr>
+                    <w:sz w:val="24"/>
+                    <w:szCs w:val="24"/>
+                    <w:rtl w:val="0"/>
+                  </w:rPr>
+                  <w:t xml:space="preserve">Marina Jelovac</w:t>
+                </w:r>
+              </w:p>
+              <w:p>
+                <w:pPr>
+                  <w:spacing w:after="0" w:line="240" w:lineRule="auto"/>
+                  <w:rPr>
+                    <w:sz w:val="24"/>
+                    <w:szCs w:val="24"/>
+                  </w:rPr>
+                </w:pPr>
+                <w:r>
+                  <w:rPr>
+                    <w:sz w:val="24"/>
+                    <w:szCs w:val="24"/>
+                    <w:rtl w:val="0"/>
+                  </w:rPr>
+                  <w:t xml:space="preserve">Institut za molekularnu genetiku</w:t>
+                </w:r>
+              </w:p>
+              <w:p>
+                <w:pPr>
+                  <w:spacing w:after="0" w:line="240" w:lineRule="auto"/>
+                  <w:rPr>
+                    <w:sz w:val="24"/>
+                    <w:szCs w:val="24"/>
+                  </w:rPr>
+                </w:pPr>
+                <w:r>
+                  <w:rPr>
+                    <w:sz w:val="24"/>
+                    <w:szCs w:val="24"/>
+                    <w:rtl w:val="0"/>
+                  </w:rPr>
+                  <w:t xml:space="preserve">i genetičko inženjerstvo</w:t>
+                </w:r>
+              </w:p>
+              <w:p>
+                <w:pPr>
+                  <w:spacing w:after="0" w:line="240" w:lineRule="auto"/>
+                  <w:rPr/>
+                </w:pPr>
+                <w:r>
+                  <w:rPr>
+                    <w:rtl w:val="0"/>
+                  </w:rPr>
+                </w:r>
+              </w:p>
+            </w:tc>
+            <w:tc>
+              <w:tcPr/>
+              <w:p>
+                <w:pPr>
+                  <w:spacing w:after="0" w:line="240" w:lineRule="auto"/>
+                  <w:rPr>
+                    <w:sz w:val="24"/>
+                    <w:szCs w:val="24"/>
+                  </w:rPr>
+                </w:pPr>
+                <w:r>
+                  <w:rPr>
+                    <w:sz w:val="24"/>
+                    <w:szCs w:val="24"/>
+                    <w:rtl w:val="0"/>
+                  </w:rPr>
+                  <w:t xml:space="preserve">dr Marina Anđelković Nikolić</w:t>
+                </w:r>
+              </w:p>
+              <w:p>
+                <w:pPr>
+                  <w:spacing w:after="0" w:line="240" w:lineRule="auto"/>
+                  <w:rPr>
+                    <w:sz w:val="24"/>
+                    <w:szCs w:val="24"/>
+                  </w:rPr>
+                </w:pPr>
+                <w:r>
+                  <w:rPr>
+                    <w:sz w:val="24"/>
+                    <w:szCs w:val="24"/>
+                    <w:rtl w:val="0"/>
+                  </w:rPr>
+                  <w:t xml:space="preserve">Institut za molekularnu genetiku</w:t>
+                </w:r>
+              </w:p>
+              <w:p>
+                <w:pPr>
+                  <w:spacing w:after="0" w:line="240" w:lineRule="auto"/>
+                  <w:rPr>
+                    <w:sz w:val="24"/>
+                    <w:szCs w:val="24"/>
+                  </w:rPr>
+                </w:pPr>
+                <w:r>
+                  <w:rPr>
+                    <w:sz w:val="24"/>
+                    <w:szCs w:val="24"/>
+                    <w:rtl w:val="0"/>
+                  </w:rPr>
+                  <w:t xml:space="preserve">i genetičko inženjerstvo</w:t>
+                </w:r>
+              </w:p>
+            </w:tc>
+          </w:tr>
+          <w:tr>
+            <w:trPr>
+              <w:cantSplit w:val="0"/>
+              <w:tblHeader w:val="0"/>
+            </w:trPr>
+            <w:tc>
+              <w:tcPr/>
+              <w:p>
+                <w:pPr>
+                  <w:spacing w:after="0" w:line="240" w:lineRule="auto"/>
+                  <w:rPr/>
+                </w:pPr>
+                <w:r>
+                  <w:rPr/>
+                  <w:drawing>
+                    <wp:inline distB="0" distT="0" distL="0" distR="0">
+                      <wp:extent cx="2076449" cy="438149"/>
+                      <wp:effectExtent b="0" l="0" r="0" t="0"/>
+                      <wp:docPr descr="A close-up of a blue pen&#10;&#10;Description automatically generated" id="20" name="image2.jpg"/>
+                      <a:graphic>
+                        <a:graphicData uri="http://schemas.openxmlformats.org/drawingml/2006/picture">
+                          <pic:pic>
+                            <pic:nvPicPr>
+                              <pic:cNvPr descr="A close-up of a blue pen&#10;&#10;Description automatically generated" id="0" name="image2.jpg"/>
+                              <pic:cNvPicPr preferRelativeResize="0"/>
+                            </pic:nvPicPr>
+                            <pic:blipFill>
+                              <a:blip r:embed="rId16"/>
+                              <a:srcRect b="11406" l="0" r="0" t="18312"/>
+                              <a:stretch>
+                                <a:fillRect/>
+                              </a:stretch>
+                            </pic:blipFill>
+                            <pic:spPr>
+                              <a:xfrm>
+                                <a:off x="0" y="0"/>
+                                <a:ext cx="2076449" cy="438149"/>
+                              </a:xfrm>
+                              <a:prstGeom prst="rect"/>
+                              <a:ln/>
+                            </pic:spPr>
+                          </pic:pic>
+                        </a:graphicData>
+                      </a:graphic>
+                    </wp:inline>
+                  </w:drawing>
+                </w:r>
+                <w:r>
+                  <w:rPr>
+                    <w:rtl w:val="0"/>
+                  </w:rPr>
+                </w:r>
+              </w:p>
+            </w:tc>
+            <w:tc>
+              <w:tcPr/>
+              <w:p>
+                <w:pPr>
+                  <w:spacing w:after="0" w:line="240" w:lineRule="auto"/>
+                  <w:rPr>
+                    <w:sz w:val="24"/>
+                    <w:szCs w:val="24"/>
+                  </w:rPr>
+                </w:pPr>
+                <w:r>
+                  <w:rPr>
+                    <w:rtl w:val="0"/>
+                  </w:rPr>
+                </w:r>
+              </w:p>
+            </w:tc>
+          </w:tr>
+          <w:tr>
+            <w:trPr>
+              <w:cantSplit w:val="0"/>
+              <w:tblHeader w:val="0"/>
+            </w:trPr>
+            <w:tc>
+              <w:tcPr/>
+              <w:p>
+                <w:pPr>
+                  <w:spacing w:after="0" w:line="240" w:lineRule="auto"/>
+                  <w:jc w:val="both"/>
+                  <w:rPr>
+                    <w:sz w:val="24"/>
+                    <w:szCs w:val="24"/>
+                  </w:rPr>
+                </w:pPr>
+                <w:r>
+                  <w:rPr>
+                    <w:sz w:val="24"/>
+                    <w:szCs w:val="24"/>
+                    <w:rtl w:val="0"/>
+                  </w:rPr>
+                  <w:t xml:space="preserve">dr Kristel Klaassen Ljubičić</w:t>
+                </w:r>
+              </w:p>
+              <w:p>
+                <w:pPr>
+                  <w:spacing w:after="0" w:line="240" w:lineRule="auto"/>
+                  <w:rPr>
+                    <w:sz w:val="24"/>
+                    <w:szCs w:val="24"/>
+                  </w:rPr>
+                </w:pPr>
+                <w:r>
+                  <w:rPr>
+                    <w:sz w:val="24"/>
+                    <w:szCs w:val="24"/>
+                    <w:rtl w:val="0"/>
+                  </w:rPr>
+                  <w:t xml:space="preserve">Institut za molekularnu genetiku</w:t>
+                </w:r>
+              </w:p>
+              <w:p>
+                <w:pPr>
+                  <w:spacing w:after="0" w:line="240" w:lineRule="auto"/>
+                  <w:rPr>
+                    <w:sz w:val="24"/>
+                    <w:szCs w:val="24"/>
+                  </w:rPr>
+                </w:pPr>
+                <w:r>
+                  <w:rPr>
+                    <w:sz w:val="24"/>
+                    <w:szCs w:val="24"/>
+                    <w:rtl w:val="0"/>
+                  </w:rPr>
+                  <w:t xml:space="preserve">i genetičko inženjerstvo</w:t>
+                </w:r>
+              </w:p>
+            </w:tc>
+            <w:tc>
+              <w:tcPr/>
+              <w:p>
+                <w:pPr>
+                  <w:rPr/>
+                </w:pPr>
+                <w:r>
+                  <w:rPr>
+                    <w:rtl w:val="0"/>
+                  </w:rPr>
+                </w:r>
+              </w:p>
+            </w:tc>
+          </w:tr>
+        </w:tbl>
+      </w:sdtContent>
+    </w:sdt>
+    <w:p>
+      <w:pPr>
+        <w:rPr>
+          <w:sz w:val="24"/>
+          <w:szCs w:val="24"/>
+        </w:rPr>
+      </w:pPr>
+      <w:r>
+        <w:rPr>
+          <w:sz w:val="24"/>
+          <w:szCs w:val="24"/>
+          <w:rtl w:val="0"/>
+        </w:rPr>
+        <w:t xml:space="preserve">{%p endif %}</w:t>
+      </w:r>
+    </w:p>
+    <w:p>
+      <w:pPr>
         <w:rPr>
           <w:b w:val="1"/>
           <w:bCs w:val="1"/>
@@ -6472,7 +7544,7 @@
       </w:r>
     </w:p>
     <w:sectPr>
-      <w:footerReference r:id="rId15" w:type="default"/>
+      <w:footerReference r:id="rId18" w:type="default"/>
       <w:pgSz w:h="15840" w:w="12240" w:orient="portrait"/>
       <w:pgMar w:bottom="1440" w:top="1440" w:left="1440" w:right="1440" w:header="720" w:footer="720"/>
       <w:pgNumType w:start="1"/>
@@ -7279,6 +8351,20 @@
       </w:tblCellMar>
     </w:tblPr>
   </w:style>
+  <w:style w:type="table" w:styleId="Table10">
+    <w:basedOn w:val="TableNormal"/>
+    <w:tblPr>
+      <w:tblStyleRowBandSize w:val="1"/>
+      <w:tblStyleColBandSize w:val="1"/>
+    </w:tblPr>
+  </w:style>
+  <w:style w:type="table" w:styleId="Table11">
+    <w:basedOn w:val="TableNormal"/>
+    <w:tblPr>
+      <w:tblStyleRowBandSize w:val="1"/>
+      <w:tblStyleColBandSize w:val="1"/>
+    </w:tblPr>
+  </w:style>
 </w:styles>
 </file>
 
@@ -7579,7 +8665,7 @@
 
 <file path=customXML/item1.xml><?xml version="1.0" encoding="utf-8"?>
 <go:gDocsCustomXmlDataStorage xmlns:go="http://customooxmlschemas.google.com/" xmlns:r="http://schemas.openxmlformats.org/officeDocument/2006/relationships" uri="GoogleDocsCustomDataVersion2">
-  <go:docsCustomData xmlns:go="http://customooxmlschemas.google.com/" roundtripDataSignature="AMtx7mhQNsBy5gGcy+b/6tKBtCi/0ve8nQ==">CgMxLjAaHwoBMBIaChgICVIUChJ0YWJsZS5pdzZybjN6NWtmYTUaHwoBMRIaChgICVIUChJ0YWJsZS53dDc4Mm5iNG9ndW8aHwoBMhIaChgICVIUChJ0YWJsZS5oNHdweDBqMXJ1NjEaHwoBMxIaChgICVIUChJ0YWJsZS51N3ppYTR4OW9uOW0aHwoBNBIaChgICVIUChJ0YWJsZS56Y2NtczRydWZ3MjkyDmguZ2JsczAxN2pzZWcyMg5oLjl1czByNnY3d3BoNjgAciExR1dqN0V5cEdpMTBZV0d4RU00RUpQUjlXR29QRjZGN28=</go:docsCustomData>
+  <go:docsCustomData xmlns:go="http://customooxmlschemas.google.com/" roundtripDataSignature="AMtx7mgkVgKejjYMe+BeJKqqB9JKjobxHA==">CgMxLjAaHwoBMBIaChgICVIUChJ0YWJsZS5pdzZybjN6NWtmYTUaHwoBMRIaChgICVIUChJ0YWJsZS53dDc4Mm5iNG9ndW8aHwoBMhIaChgICVIUChJ0YWJsZS5oNHdweDBqMXJ1NjEaHwoBMxIaChgICVIUChJ0YWJsZS51N3ppYTR4OW9uOW0aHwoBNBIaChgICVIUChJ0YWJsZS56Y2NtczRydWZ3MjkaHwoBNRIaChgICVIUChJ0YWJsZS42NjBxbTlyY2wzb2IyDmguZ2JsczAxN2pzZWcyMg5oLjl1czByNnY3d3BoNjIOaC45dXMwcjZ2N3dwaDYyDmguOXVzMHI2djd3cGg2OAByITFHV2o3RXlwR2kxMFlXR3hFTTRFSlBSOVdHb1BGNkY3bw==</go:docsCustomData>
 </go:gDocsCustomXmlDataStorage>
 </file>
 

</xml_diff>

<commit_message>
Added stauth and preparing for full deployment
</commit_message>
<xml_diff>
--- a/izveštaj_template.docx
+++ b/izveštaj_template.docx
@@ -14,12 +14,12 @@
           <wp:inline distB="0" distT="0" distL="0" distR="0">
             <wp:extent cx="5943600" cy="1435100"/>
             <wp:effectExtent b="0" l="0" r="0" t="0"/>
-            <wp:docPr descr="Graphical user interface, application&#10;&#10;Description automatically generated" id="15" name="image6.png"/>
+            <wp:docPr descr="Graphical user interface, application&#10;&#10;Description automatically generated" id="15" name="image9.png"/>
             <a:graphic>
               <a:graphicData uri="http://schemas.openxmlformats.org/drawingml/2006/picture">
                 <pic:pic>
                   <pic:nvPicPr>
-                    <pic:cNvPr descr="Graphical user interface, application&#10;&#10;Description automatically generated" id="0" name="image6.png"/>
+                    <pic:cNvPr descr="Graphical user interface, application&#10;&#10;Description automatically generated" id="0" name="image9.png"/>
                     <pic:cNvPicPr preferRelativeResize="0"/>
                   </pic:nvPicPr>
                   <pic:blipFill>
@@ -3621,7 +3621,7 @@
           <w:szCs w:val="24"/>
           <w:rtl w:val="0"/>
         </w:rPr>
-        <w:t xml:space="preserve">Kris</w:t>
+        <w:t xml:space="preserve">Kristel Klaassen</w:t>
       </w:r>
       <w:r>
         <w:rPr>
@@ -3717,12 +3717,12 @@
                 <wp:inline distB="0" distT="0" distL="0" distR="0">
                   <wp:extent cx="2076450" cy="438150"/>
                   <wp:effectExtent b="0" l="0" r="0" t="0"/>
-                  <wp:docPr descr="A close-up of a blue pen&#10;&#10;Description automatically generated" id="18" name="image7.jpg"/>
+                  <wp:docPr descr="A close-up of a blue pen&#10;&#10;Description automatically generated" id="18" name="image1.jpg"/>
                   <a:graphic>
                     <a:graphicData uri="http://schemas.openxmlformats.org/drawingml/2006/picture">
                       <pic:pic>
                         <pic:nvPicPr>
-                          <pic:cNvPr descr="A close-up of a blue pen&#10;&#10;Description automatically generated" id="0" name="image7.jpg"/>
+                          <pic:cNvPr descr="A close-up of a blue pen&#10;&#10;Description automatically generated" id="0" name="image1.jpg"/>
                           <pic:cNvPicPr preferRelativeResize="0"/>
                         </pic:nvPicPr>
                         <pic:blipFill>
@@ -3791,12 +3791,12 @@
                 <wp:inline distB="114300" distT="114300" distL="114300" distR="114300">
                   <wp:extent cx="1971675" cy="400050"/>
                   <wp:effectExtent b="0" l="0" r="0" t="0"/>
-                  <wp:docPr id="23" name="image3.png"/>
+                  <wp:docPr id="23" name="image2.png"/>
                   <a:graphic>
                     <a:graphicData uri="http://schemas.openxmlformats.org/drawingml/2006/picture">
                       <pic:pic>
                         <pic:nvPicPr>
-                          <pic:cNvPr id="0" name="image3.png"/>
+                          <pic:cNvPr id="0" name="image2.png"/>
                           <pic:cNvPicPr preferRelativeResize="0"/>
                         </pic:nvPicPr>
                         <pic:blipFill>
@@ -3995,7 +3995,7 @@
           <w:szCs w:val="24"/>
           <w:rtl w:val="0"/>
         </w:rPr>
-        <w:t xml:space="preserve">Vlada</w:t>
+        <w:t xml:space="preserve">Vladimir Gašić</w:t>
       </w:r>
       <w:r>
         <w:rPr>
@@ -4036,7 +4036,7 @@
     <w:sdt>
       <w:sdtPr>
         <w:lock w:val="contentLocked"/>
-        <w:id w:val="-182493033"/>
+        <w:id w:val="859721572"/>
         <w:tag w:val="goog_rdk_0"/>
       </w:sdtPr>
       <w:sdtContent>
@@ -4098,12 +4098,12 @@
                     <wp:inline distB="0" distT="0" distL="0" distR="0">
                       <wp:extent cx="1769528" cy="548860"/>
                       <wp:effectExtent b="0" l="0" r="0" t="0"/>
-                      <wp:docPr id="27" name="image8.png"/>
+                      <wp:docPr id="27" name="image10.png"/>
                       <a:graphic>
                         <a:graphicData uri="http://schemas.openxmlformats.org/drawingml/2006/picture">
                           <pic:pic>
                             <pic:nvPicPr>
-                              <pic:cNvPr id="0" name="image8.png"/>
+                              <pic:cNvPr id="0" name="image10.png"/>
                               <pic:cNvPicPr preferRelativeResize="0"/>
                             </pic:nvPicPr>
                             <pic:blipFill>
@@ -4182,12 +4182,12 @@
                     <wp:inline distB="114300" distT="114300" distL="114300" distR="114300">
                       <wp:extent cx="1971675" cy="400050"/>
                       <wp:effectExtent b="0" l="0" r="0" t="0"/>
-                      <wp:docPr id="13" name="image3.png"/>
+                      <wp:docPr id="13" name="image2.png"/>
                       <a:graphic>
                         <a:graphicData uri="http://schemas.openxmlformats.org/drawingml/2006/picture">
                           <pic:pic>
                             <pic:nvPicPr>
-                              <pic:cNvPr id="0" name="image3.png"/>
+                              <pic:cNvPr id="0" name="image2.png"/>
                               <pic:cNvPicPr preferRelativeResize="0"/>
                             </pic:nvPicPr>
                             <pic:blipFill>
@@ -4400,7 +4400,7 @@
           <w:szCs w:val="24"/>
           <w:rtl w:val="0"/>
         </w:rPr>
-        <w:t xml:space="preserve">Irena</w:t>
+        <w:t xml:space="preserve">Irena Marjanović</w:t>
       </w:r>
       <w:r>
         <w:rPr>
@@ -4441,7 +4441,7 @@
     <w:sdt>
       <w:sdtPr>
         <w:lock w:val="contentLocked"/>
-        <w:id w:val="-2105833693"/>
+        <w:id w:val="-179081136"/>
         <w:tag w:val="goog_rdk_1"/>
       </w:sdtPr>
       <w:sdtContent>
@@ -4506,12 +4506,12 @@
                     <wp:inline distB="0" distT="0" distL="0" distR="0">
                       <wp:extent cx="1614488" cy="563789"/>
                       <wp:effectExtent b="0" l="0" r="0" t="0"/>
-                      <wp:docPr id="30" name="image11.png"/>
+                      <wp:docPr id="30" name="image4.png"/>
                       <a:graphic>
                         <a:graphicData uri="http://schemas.openxmlformats.org/drawingml/2006/picture">
                           <pic:pic>
                             <pic:nvPicPr>
-                              <pic:cNvPr id="0" name="image11.png"/>
+                              <pic:cNvPr id="0" name="image4.png"/>
                               <pic:cNvPicPr preferRelativeResize="0"/>
                             </pic:nvPicPr>
                             <pic:blipFill>
@@ -4590,12 +4590,12 @@
                     <wp:inline distB="114300" distT="114300" distL="114300" distR="114300">
                       <wp:extent cx="1971675" cy="400050"/>
                       <wp:effectExtent b="0" l="0" r="0" t="0"/>
-                      <wp:docPr id="19" name="image3.png"/>
+                      <wp:docPr id="19" name="image2.png"/>
                       <a:graphic>
                         <a:graphicData uri="http://schemas.openxmlformats.org/drawingml/2006/picture">
                           <pic:pic>
                             <pic:nvPicPr>
-                              <pic:cNvPr id="0" name="image3.png"/>
+                              <pic:cNvPr id="0" name="image2.png"/>
                               <pic:cNvPicPr preferRelativeResize="0"/>
                             </pic:nvPicPr>
                             <pic:blipFill>
@@ -4808,7 +4808,7 @@
           <w:szCs w:val="24"/>
           <w:rtl w:val="0"/>
         </w:rPr>
-        <w:t xml:space="preserve">Anita</w:t>
+        <w:t xml:space="preserve">Anita Skakić</w:t>
       </w:r>
       <w:r>
         <w:rPr>
@@ -4849,7 +4849,7 @@
     <w:sdt>
       <w:sdtPr>
         <w:lock w:val="contentLocked"/>
-        <w:id w:val="-1689978118"/>
+        <w:id w:val="-1884164939"/>
         <w:tag w:val="goog_rdk_2"/>
       </w:sdtPr>
       <w:sdtContent>
@@ -4911,12 +4911,12 @@
                     <wp:inline distB="0" distT="0" distL="0" distR="0">
                       <wp:extent cx="1571239" cy="601917"/>
                       <wp:effectExtent b="0" l="0" r="0" t="0"/>
-                      <wp:docPr id="17" name="image5.png"/>
+                      <wp:docPr id="17" name="image7.png"/>
                       <a:graphic>
                         <a:graphicData uri="http://schemas.openxmlformats.org/drawingml/2006/picture">
                           <pic:pic>
                             <pic:nvPicPr>
-                              <pic:cNvPr id="0" name="image5.png"/>
+                              <pic:cNvPr id="0" name="image7.png"/>
                               <pic:cNvPicPr preferRelativeResize="0"/>
                             </pic:nvPicPr>
                             <pic:blipFill>
@@ -4995,12 +4995,12 @@
                     <wp:inline distB="114300" distT="114300" distL="114300" distR="114300">
                       <wp:extent cx="1971675" cy="400050"/>
                       <wp:effectExtent b="0" l="0" r="0" t="0"/>
-                      <wp:docPr id="14" name="image3.png"/>
+                      <wp:docPr id="14" name="image2.png"/>
                       <a:graphic>
                         <a:graphicData uri="http://schemas.openxmlformats.org/drawingml/2006/picture">
                           <pic:pic>
                             <pic:nvPicPr>
-                              <pic:cNvPr id="0" name="image3.png"/>
+                              <pic:cNvPr id="0" name="image2.png"/>
                               <pic:cNvPicPr preferRelativeResize="0"/>
                             </pic:nvPicPr>
                             <pic:blipFill>
@@ -5213,7 +5213,7 @@
           <w:szCs w:val="24"/>
           <w:rtl w:val="0"/>
         </w:rPr>
-        <w:t xml:space="preserve">Bojzi</w:t>
+        <w:t xml:space="preserve">Bojan Ristivojević</w:t>
       </w:r>
       <w:r>
         <w:rPr>
@@ -5254,7 +5254,7 @@
     <w:sdt>
       <w:sdtPr>
         <w:lock w:val="contentLocked"/>
-        <w:id w:val="-716454974"/>
+        <w:id w:val="319787470"/>
         <w:tag w:val="goog_rdk_3"/>
       </w:sdtPr>
       <w:sdtContent>
@@ -5319,12 +5319,12 @@
                     <wp:inline distB="114300" distT="114300" distL="114300" distR="114300">
                       <wp:extent cx="701662" cy="1452563"/>
                       <wp:effectExtent b="0" l="0" r="0" t="0"/>
-                      <wp:docPr id="22" name="image10.jpg"/>
+                      <wp:docPr id="22" name="image8.jpg"/>
                       <a:graphic>
                         <a:graphicData uri="http://schemas.openxmlformats.org/drawingml/2006/picture">
                           <pic:pic>
                             <pic:nvPicPr>
-                              <pic:cNvPr id="0" name="image10.jpg"/>
+                              <pic:cNvPr id="0" name="image8.jpg"/>
                               <pic:cNvPicPr preferRelativeResize="0"/>
                             </pic:nvPicPr>
                             <pic:blipFill>
@@ -5403,12 +5403,12 @@
                     <wp:inline distB="114300" distT="114300" distL="114300" distR="114300">
                       <wp:extent cx="1971675" cy="400050"/>
                       <wp:effectExtent b="0" l="0" r="0" t="0"/>
-                      <wp:docPr id="28" name="image3.png"/>
+                      <wp:docPr id="28" name="image2.png"/>
                       <a:graphic>
                         <a:graphicData uri="http://schemas.openxmlformats.org/drawingml/2006/picture">
                           <pic:pic>
                             <pic:nvPicPr>
-                              <pic:cNvPr id="0" name="image3.png"/>
+                              <pic:cNvPr id="0" name="image2.png"/>
                               <pic:cNvPicPr preferRelativeResize="0"/>
                             </pic:nvPicPr>
                             <pic:blipFill>
@@ -5621,7 +5621,7 @@
           <w:szCs w:val="24"/>
           <w:rtl w:val="0"/>
         </w:rPr>
-        <w:t xml:space="preserve">Makica</w:t>
+        <w:t xml:space="preserve">Marina Parezanović</w:t>
       </w:r>
       <w:r>
         <w:rPr>
@@ -5662,7 +5662,7 @@
     <w:sdt>
       <w:sdtPr>
         <w:lock w:val="contentLocked"/>
-        <w:id w:val="-658792564"/>
+        <w:id w:val="-750281514"/>
         <w:tag w:val="goog_rdk_4"/>
       </w:sdtPr>
       <w:sdtContent>
@@ -5695,7 +5695,7 @@
               </w:tcPr>
               <w:p>
                 <w:pPr>
-                  <w:spacing w:after="0" w:line="276" w:lineRule="auto"/>
+                  <w:spacing w:after="0" w:line="240" w:lineRule="auto"/>
                   <w:rPr>
                     <w:sz w:val="24"/>
                     <w:szCs w:val="24"/>
@@ -5712,7 +5712,7 @@
               </w:p>
               <w:p>
                 <w:pPr>
-                  <w:spacing w:after="0" w:line="276" w:lineRule="auto"/>
+                  <w:spacing w:after="0" w:line="240" w:lineRule="auto"/>
                   <w:rPr>
                     <w:sz w:val="24"/>
                     <w:szCs w:val="24"/>
@@ -5724,12 +5724,12 @@
                     <wp:inline distB="0" distT="0" distL="0" distR="0">
                       <wp:extent cx="1571239" cy="601917"/>
                       <wp:effectExtent b="0" l="0" r="0" t="0"/>
-                      <wp:docPr id="21" name="image5.png"/>
+                      <wp:docPr id="21" name="image7.png"/>
                       <a:graphic>
                         <a:graphicData uri="http://schemas.openxmlformats.org/drawingml/2006/picture">
                           <pic:pic>
                             <pic:nvPicPr>
-                              <pic:cNvPr id="0" name="image5.png"/>
+                              <pic:cNvPr id="0" name="image7.png"/>
                               <pic:cNvPicPr preferRelativeResize="0"/>
                             </pic:nvPicPr>
                             <pic:blipFill>
@@ -5772,7 +5772,7 @@
               </w:tcPr>
               <w:p>
                 <w:pPr>
-                  <w:spacing w:after="0" w:line="276.0005454545455" w:lineRule="auto"/>
+                  <w:spacing w:after="0" w:line="240" w:lineRule="auto"/>
                   <w:ind w:left="360" w:firstLine="0"/>
                   <w:jc w:val="both"/>
                   <w:rPr>
@@ -5791,7 +5791,7 @@
               </w:p>
               <w:p>
                 <w:pPr>
-                  <w:spacing w:after="0" w:line="276" w:lineRule="auto"/>
+                  <w:spacing w:after="0" w:line="240" w:lineRule="auto"/>
                   <w:ind w:left="360" w:firstLine="0"/>
                   <w:jc w:val="both"/>
                   <w:rPr>
@@ -5808,12 +5808,12 @@
                     <wp:inline distB="114300" distT="114300" distL="114300" distR="114300">
                       <wp:extent cx="1971675" cy="400050"/>
                       <wp:effectExtent b="0" l="0" r="0" t="0"/>
-                      <wp:docPr id="26" name="image3.png"/>
+                      <wp:docPr id="26" name="image2.png"/>
                       <a:graphic>
                         <a:graphicData uri="http://schemas.openxmlformats.org/drawingml/2006/picture">
                           <pic:pic>
                             <pic:nvPicPr>
-                              <pic:cNvPr id="0" name="image3.png"/>
+                              <pic:cNvPr id="0" name="image2.png"/>
                               <pic:cNvPicPr preferRelativeResize="0"/>
                             </pic:nvPicPr>
                             <pic:blipFill>
@@ -5856,7 +5856,7 @@
               </w:tcPr>
               <w:p>
                 <w:pPr>
-                  <w:spacing w:after="0" w:line="276" w:lineRule="auto"/>
+                  <w:spacing w:after="0" w:line="240" w:lineRule="auto"/>
                   <w:rPr>
                     <w:sz w:val="24"/>
                     <w:szCs w:val="24"/>
@@ -5873,7 +5873,7 @@
               </w:p>
               <w:p>
                 <w:pPr>
-                  <w:spacing w:after="0" w:line="276" w:lineRule="auto"/>
+                  <w:spacing w:after="0" w:line="240" w:lineRule="auto"/>
                   <w:rPr>
                     <w:sz w:val="24"/>
                     <w:szCs w:val="24"/>
@@ -5890,7 +5890,7 @@
               </w:p>
               <w:p>
                 <w:pPr>
-                  <w:spacing w:after="0" w:line="276" w:lineRule="auto"/>
+                  <w:spacing w:after="0" w:line="240" w:lineRule="auto"/>
                   <w:rPr>
                     <w:sz w:val="24"/>
                     <w:szCs w:val="24"/>
@@ -5918,7 +5918,7 @@
               </w:tcPr>
               <w:p>
                 <w:pPr>
-                  <w:spacing w:after="0" w:line="276.0005454545455" w:lineRule="auto"/>
+                  <w:spacing w:after="0" w:line="240" w:lineRule="auto"/>
                   <w:ind w:left="360" w:firstLine="0"/>
                   <w:rPr>
                     <w:sz w:val="24"/>
@@ -5936,7 +5936,7 @@
               </w:p>
               <w:p>
                 <w:pPr>
-                  <w:spacing w:after="0" w:line="276.0005454545455" w:lineRule="auto"/>
+                  <w:spacing w:after="0" w:line="240" w:lineRule="auto"/>
                   <w:ind w:left="360" w:firstLine="0"/>
                   <w:rPr>
                     <w:sz w:val="24"/>
@@ -5954,7 +5954,7 @@
               </w:p>
               <w:p>
                 <w:pPr>
-                  <w:spacing w:after="0" w:line="276.0005454545455" w:lineRule="auto"/>
+                  <w:spacing w:after="0" w:line="240" w:lineRule="auto"/>
                   <w:ind w:left="360" w:firstLine="0"/>
                   <w:rPr>
                     <w:sz w:val="24"/>
@@ -5983,7 +5983,7 @@
               </w:tcPr>
               <w:p>
                 <w:pPr>
-                  <w:spacing w:after="0" w:line="276" w:lineRule="auto"/>
+                  <w:spacing w:after="0" w:line="240" w:lineRule="auto"/>
                   <w:rPr/>
                 </w:pPr>
                 <w:r>
@@ -5992,12 +5992,12 @@
                     <wp:inline distB="0" distT="0" distL="0" distR="0">
                       <wp:extent cx="476868" cy="1228845"/>
                       <wp:effectExtent b="0" l="0" r="0" t="0"/>
-                      <wp:docPr id="29" name="image12.png"/>
+                      <wp:docPr id="29" name="image3.png"/>
                       <a:graphic>
                         <a:graphicData uri="http://schemas.openxmlformats.org/drawingml/2006/picture">
                           <pic:pic>
                             <pic:nvPicPr>
-                              <pic:cNvPr id="0" name="image12.png"/>
+                              <pic:cNvPr id="0" name="image3.png"/>
                               <pic:cNvPicPr preferRelativeResize="0"/>
                             </pic:nvPicPr>
                             <pic:blipFill>
@@ -6029,7 +6029,7 @@
               </w:p>
               <w:p>
                 <w:pPr>
-                  <w:spacing w:after="0" w:line="276" w:lineRule="auto"/>
+                  <w:spacing w:after="0" w:line="240" w:lineRule="auto"/>
                   <w:jc w:val="both"/>
                   <w:rPr>
                     <w:sz w:val="24"/>
@@ -6047,7 +6047,7 @@
               </w:p>
               <w:p>
                 <w:pPr>
-                  <w:spacing w:after="0" w:line="276" w:lineRule="auto"/>
+                  <w:spacing w:after="0" w:line="240" w:lineRule="auto"/>
                   <w:rPr>
                     <w:sz w:val="24"/>
                     <w:szCs w:val="24"/>
@@ -6064,7 +6064,7 @@
               </w:p>
               <w:p>
                 <w:pPr>
-                  <w:spacing w:after="0" w:line="276" w:lineRule="auto"/>
+                  <w:spacing w:after="0" w:line="240" w:lineRule="auto"/>
                   <w:rPr>
                     <w:sz w:val="26"/>
                     <w:szCs w:val="26"/>
@@ -6097,7 +6097,7 @@
               </w:tcPr>
               <w:p>
                 <w:pPr>
-                  <w:spacing w:after="0" w:line="276.0005454545455" w:lineRule="auto"/>
+                  <w:spacing w:after="0" w:line="240" w:lineRule="auto"/>
                   <w:ind w:left="360" w:firstLine="0"/>
                   <w:rPr>
                     <w:sz w:val="24"/>
@@ -6166,7 +6166,7 @@
           <w:szCs w:val="24"/>
           <w:rtl w:val="0"/>
         </w:rPr>
-        <w:t xml:space="preserve">Đole</w:t>
+        <w:t xml:space="preserve">Đorđe Pavlović</w:t>
       </w:r>
       <w:r>
         <w:rPr>
@@ -6262,12 +6262,12 @@
                 <wp:inline distB="0" distT="0" distL="0" distR="0">
                   <wp:extent cx="1495425" cy="504825"/>
                   <wp:effectExtent b="0" l="0" r="0" t="0"/>
-                  <wp:docPr id="16" name="image1.png"/>
+                  <wp:docPr id="16" name="image11.png"/>
                   <a:graphic>
                     <a:graphicData uri="http://schemas.openxmlformats.org/drawingml/2006/picture">
                       <pic:pic>
                         <pic:nvPicPr>
-                          <pic:cNvPr id="0" name="image1.png"/>
+                          <pic:cNvPr id="0" name="image11.png"/>
                           <pic:cNvPicPr preferRelativeResize="0"/>
                         </pic:nvPicPr>
                         <pic:blipFill>
@@ -6319,7 +6319,7 @@
           </w:p>
           <w:p>
             <w:pPr>
-              <w:spacing w:after="0" w:line="276" w:lineRule="auto"/>
+              <w:spacing w:after="0" w:line="240" w:lineRule="auto"/>
               <w:jc w:val="both"/>
               <w:rPr>
                 <w:sz w:val="24"/>
@@ -6335,12 +6335,12 @@
                 <wp:inline distB="0" distT="0" distL="0" distR="0">
                   <wp:extent cx="1971675" cy="400050"/>
                   <wp:effectExtent b="0" l="0" r="0" t="0"/>
-                  <wp:docPr id="24" name="image4.png"/>
+                  <wp:docPr id="24" name="image5.png"/>
                   <a:graphic>
                     <a:graphicData uri="http://schemas.openxmlformats.org/drawingml/2006/picture">
                       <pic:pic>
                         <pic:nvPicPr>
-                          <pic:cNvPr id="0" name="image4.png"/>
+                          <pic:cNvPr id="0" name="image5.png"/>
                           <pic:cNvPicPr preferRelativeResize="0"/>
                         </pic:nvPicPr>
                         <pic:blipFill>
@@ -6417,10 +6417,7 @@
           <w:p>
             <w:pPr>
               <w:spacing w:after="0" w:line="240" w:lineRule="auto"/>
-              <w:rPr>
-                <w:sz w:val="24"/>
-                <w:szCs w:val="24"/>
-              </w:rPr>
+              <w:rPr/>
             </w:pPr>
             <w:r>
               <w:rPr>
@@ -6430,12 +6427,6 @@
               </w:rPr>
               <w:t xml:space="preserve">i genetičko inženjerstvo</w:t>
             </w:r>
-          </w:p>
-          <w:p>
-            <w:pPr>
-              <w:spacing w:after="0" w:line="240" w:lineRule="auto"/>
-              <w:rPr/>
-            </w:pPr>
             <w:r>
               <w:rPr>
                 <w:rtl w:val="0"/>
@@ -6516,12 +6507,12 @@
                 <wp:inline distB="0" distT="0" distL="0" distR="0">
                   <wp:extent cx="2076449" cy="438149"/>
                   <wp:effectExtent b="0" l="0" r="0" t="0"/>
-                  <wp:docPr descr="A close-up of a blue pen&#10;&#10;Description automatically generated" id="25" name="image2.jpg"/>
+                  <wp:docPr descr="A close-up of a blue pen&#10;&#10;Description automatically generated" id="25" name="image12.jpg"/>
                   <a:graphic>
                     <a:graphicData uri="http://schemas.openxmlformats.org/drawingml/2006/picture">
                       <pic:pic>
                         <pic:nvPicPr>
-                          <pic:cNvPr descr="A close-up of a blue pen&#10;&#10;Description automatically generated" id="0" name="image2.jpg"/>
+                          <pic:cNvPr descr="A close-up of a blue pen&#10;&#10;Description automatically generated" id="0" name="image12.jpg"/>
                           <pic:cNvPicPr preferRelativeResize="0"/>
                         </pic:nvPicPr>
                         <pic:blipFill>
@@ -6634,6 +6625,7 @@
           <w:tcPr/>
           <w:p>
             <w:pPr>
+              <w:spacing w:line="240" w:lineRule="auto"/>
               <w:rPr/>
             </w:pPr>
             <w:r>
@@ -6696,7 +6688,7 @@
           <w:szCs w:val="24"/>
           <w:rtl w:val="0"/>
         </w:rPr>
-        <w:t xml:space="preserve">Marina</w:t>
+        <w:t xml:space="preserve">Marina Jelovac</w:t>
       </w:r>
       <w:r>
         <w:rPr>
@@ -6737,7 +6729,7 @@
     <w:sdt>
       <w:sdtPr>
         <w:lock w:val="contentLocked"/>
-        <w:id w:val="-1303092612"/>
+        <w:id w:val="1272004981"/>
         <w:tag w:val="goog_rdk_5"/>
       </w:sdtPr>
       <w:sdtContent>
@@ -6802,12 +6794,12 @@
                     <wp:inline distB="0" distT="0" distL="0" distR="0">
                       <wp:extent cx="1300163" cy="675084"/>
                       <wp:effectExtent b="0" l="0" r="0" t="0"/>
-                      <wp:docPr id="12" name="image9.png"/>
+                      <wp:docPr id="12" name="image6.png"/>
                       <a:graphic>
                         <a:graphicData uri="http://schemas.openxmlformats.org/drawingml/2006/picture">
                           <pic:pic>
                             <pic:nvPicPr>
-                              <pic:cNvPr id="0" name="image9.png"/>
+                              <pic:cNvPr id="0" name="image6.png"/>
                               <pic:cNvPicPr preferRelativeResize="0"/>
                             </pic:nvPicPr>
                             <pic:blipFill>
@@ -6859,7 +6851,7 @@
               </w:p>
               <w:p>
                 <w:pPr>
-                  <w:spacing w:after="0" w:line="276" w:lineRule="auto"/>
+                  <w:spacing w:after="0" w:line="240" w:lineRule="auto"/>
                   <w:jc w:val="both"/>
                   <w:rPr>
                     <w:sz w:val="24"/>
@@ -6875,12 +6867,12 @@
                     <wp:inline distB="0" distT="0" distL="0" distR="0">
                       <wp:extent cx="1971675" cy="400050"/>
                       <wp:effectExtent b="0" l="0" r="0" t="0"/>
-                      <wp:docPr id="11" name="image4.png"/>
+                      <wp:docPr id="11" name="image5.png"/>
                       <a:graphic>
                         <a:graphicData uri="http://schemas.openxmlformats.org/drawingml/2006/picture">
                           <pic:pic>
                             <pic:nvPicPr>
-                              <pic:cNvPr id="0" name="image4.png"/>
+                              <pic:cNvPr id="0" name="image5.png"/>
                               <pic:cNvPicPr preferRelativeResize="0"/>
                             </pic:nvPicPr>
                             <pic:blipFill>
@@ -6957,10 +6949,7 @@
               <w:p>
                 <w:pPr>
                   <w:spacing w:after="0" w:line="240" w:lineRule="auto"/>
-                  <w:rPr>
-                    <w:sz w:val="24"/>
-                    <w:szCs w:val="24"/>
-                  </w:rPr>
+                  <w:rPr/>
                 </w:pPr>
                 <w:r>
                   <w:rPr>
@@ -6970,12 +6959,6 @@
                   </w:rPr>
                   <w:t xml:space="preserve">i genetičko inženjerstvo</w:t>
                 </w:r>
-              </w:p>
-              <w:p>
-                <w:pPr>
-                  <w:spacing w:after="0" w:line="240" w:lineRule="auto"/>
-                  <w:rPr/>
-                </w:pPr>
                 <w:r>
                   <w:rPr>
                     <w:rtl w:val="0"/>
@@ -7056,12 +7039,12 @@
                     <wp:inline distB="0" distT="0" distL="0" distR="0">
                       <wp:extent cx="2076449" cy="438149"/>
                       <wp:effectExtent b="0" l="0" r="0" t="0"/>
-                      <wp:docPr descr="A close-up of a blue pen&#10;&#10;Description automatically generated" id="20" name="image2.jpg"/>
+                      <wp:docPr descr="A close-up of a blue pen&#10;&#10;Description automatically generated" id="20" name="image12.jpg"/>
                       <a:graphic>
                         <a:graphicData uri="http://schemas.openxmlformats.org/drawingml/2006/picture">
                           <pic:pic>
                             <pic:nvPicPr>
-                              <pic:cNvPr descr="A close-up of a blue pen&#10;&#10;Description automatically generated" id="0" name="image2.jpg"/>
+                              <pic:cNvPr descr="A close-up of a blue pen&#10;&#10;Description automatically generated" id="0" name="image12.jpg"/>
                               <pic:cNvPicPr preferRelativeResize="0"/>
                             </pic:nvPicPr>
                             <pic:blipFill>
@@ -7174,6 +7157,7 @@
               <w:tcPr/>
               <w:p>
                 <w:pPr>
+                  <w:spacing w:line="240" w:lineRule="auto"/>
                   <w:rPr/>
                 </w:pPr>
                 <w:r>

</xml_diff>